<commit_message>
Update ArtArena description and resume font alignment
Co-Authored-By: Claude Opus 4.6 <noreply@anthropic.com>
</commit_message>
<xml_diff>
--- a/assets/Chunjiang Liu Resume.docx
+++ b/assets/Chunjiang Liu Resume.docx
@@ -796,68 +796,73 @@
       </w:pPr>
       <w:r>
         <w:rPr>
-          <w:rFonts w:ascii="Times New Roman" w:hAnsi="Times New Roman" w:cs="Times New Roman"/>
-          <w:sz w:val="22"/>
-          <w:szCs w:val="22"/>
-        </w:rPr>
-        <w:t>YAMAHA MOTOR SOLUTIONS CO., LTD. XIAMEN</w:t>
-      </w:r>
-      <w:r>
-        <w:rPr>
-          <w:rFonts w:ascii="Times New Roman" w:hAnsi="Times New Roman" w:cs="Times New Roman"/>
-          <w:sz w:val="22"/>
-          <w:szCs w:val="22"/>
+          <w:rFonts w:ascii="Times New Roman" w:hAnsi="Times New Roman"/>
+          <w:sz w:val="22"/>
+        </w:rPr>
+        <w:t>BAKE AI INC.</w:t>
+      </w:r>
+      <w:r>
+        <w:rPr>
+          <w:rFonts w:ascii="Times New Roman" w:hAnsi="Times New Roman"/>
+          <w:sz w:val="22"/>
         </w:rPr>
         <w:tab/>
       </w:r>
       <w:r>
         <w:rPr>
-          <w:rFonts w:ascii="Times New Roman" w:hAnsi="Times New Roman" w:cs="Times New Roman"/>
-          <w:sz w:val="22"/>
-          <w:szCs w:val="22"/>
+          <w:rFonts w:ascii="Times New Roman" w:hAnsi="Times New Roman" w:hint="eastAsia"/>
+          <w:sz w:val="22"/>
+        </w:rPr>
+        <w:t xml:space="preserve">                                           </w:t>
+      </w:r>
+      <w:r>
+        <w:rPr>
+          <w:rFonts w:ascii="Times New Roman" w:hAnsi="Times New Roman"/>
+          <w:sz w:val="22"/>
         </w:rPr>
         <w:tab/>
       </w:r>
       <w:r>
         <w:rPr>
-          <w:rFonts w:ascii="Times New Roman" w:hAnsi="Times New Roman" w:cs="Times New Roman"/>
-          <w:sz w:val="22"/>
-          <w:szCs w:val="22"/>
+          <w:rFonts w:ascii="Times New Roman" w:hAnsi="Times New Roman"/>
+          <w:sz w:val="22"/>
         </w:rPr>
         <w:tab/>
-        <w:t xml:space="preserve">            </w:t>
-      </w:r>
-      <w:r>
-        <w:rPr>
-          <w:rFonts w:ascii="Times New Roman" w:hAnsi="Times New Roman" w:cs="Times New Roman"/>
-          <w:sz w:val="22"/>
-          <w:szCs w:val="22"/>
-        </w:rPr>
-        <w:t xml:space="preserve">   </w:t>
-      </w:r>
-      <w:r>
-        <w:rPr>
-          <w:rFonts w:ascii="Times New Roman" w:hAnsi="Times New Roman" w:cs="Times New Roman"/>
-          <w:sz w:val="22"/>
-          <w:szCs w:val="22"/>
-        </w:rPr>
-        <w:t>Xiamen,</w:t>
-      </w:r>
-      <w:r>
-        <w:rPr>
-          <w:rFonts w:ascii="Times New Roman" w:hAnsi="Times New Roman" w:cs="Times New Roman" w:hint="eastAsia"/>
-          <w:sz w:val="22"/>
-          <w:szCs w:val="22"/>
-        </w:rPr>
-        <w:t xml:space="preserve"> </w:t>
-      </w:r>
-      <w:r>
-        <w:rPr>
-          <w:rFonts w:ascii="Times New Roman" w:hAnsi="Times New Roman" w:cs="Times New Roman"/>
-          <w:sz w:val="22"/>
-          <w:szCs w:val="22"/>
-        </w:rPr>
-        <w:t>China</w:t>
+      </w:r>
+      <w:r>
+        <w:rPr>
+          <w:rFonts w:ascii="Times New Roman" w:hAnsi="Times New Roman"/>
+          <w:sz w:val="22"/>
+        </w:rPr>
+        <w:tab/>
+      </w:r>
+      <w:r>
+        <w:rPr>
+          <w:rFonts w:ascii="Times New Roman" w:hAnsi="Times New Roman"/>
+          <w:sz w:val="22"/>
+        </w:rPr>
+        <w:tab/>
+      </w:r>
+      <w:r>
+        <w:rPr>
+          <w:rFonts w:ascii="Times New Roman" w:hAnsi="Times New Roman"/>
+          <w:sz w:val="22"/>
+        </w:rPr>
+        <w:tab/>
+      </w:r>
+      <w:r>
+        <w:rPr>
+          <w:rFonts w:ascii="Times New Roman" w:hAnsi="Times New Roman" w:hint="eastAsia"/>
+          <w:sz w:val="22"/>
+        </w:rPr>
+        <w:t xml:space="preserve">         </w:t>
+      </w:r>
+      <w:r>
+        <w:rPr>
+          <w:rFonts w:ascii="Times New Roman" w:hAnsi="Times New Roman"/>
+          <w:sz w:val="22"/>
+        </w:rPr>
+        <w:t>San Francisco, CA</w:t>
       </w:r>
     </w:p>
     <w:p>
@@ -871,165 +876,32 @@
       </w:pPr>
       <w:r>
         <w:rPr>
-          <w:rFonts w:ascii="Times New Roman" w:hAnsi="Times New Roman" w:cs="Times New Roman"/>
+          <w:rFonts w:ascii="Times New Roman" w:hAnsi="Times New Roman"/>
           <w:i/>
-          <w:iCs/>
-          <w:sz w:val="22"/>
-          <w:szCs w:val="22"/>
-        </w:rPr>
-        <w:t xml:space="preserve">Innovation Center Intern                       </w:t>
-      </w:r>
-      <w:r>
-        <w:rPr>
-          <w:rFonts w:ascii="Times New Roman" w:hAnsi="Times New Roman" w:cs="Times New Roman"/>
-          <w:i/>
-          <w:iCs/>
-          <w:sz w:val="22"/>
-          <w:szCs w:val="22"/>
+          <w:sz w:val="22"/>
+        </w:rPr>
+        <w:t>Member of Technical Staff</w:t>
+      </w:r>
+      <w:r>
+        <w:rPr>
+          <w:rFonts w:ascii="Times New Roman" w:hAnsi="Times New Roman"/>
+          <w:sz w:val="22"/>
         </w:rPr>
         <w:tab/>
       </w:r>
       <w:r>
         <w:rPr>
-          <w:rFonts w:ascii="Times New Roman" w:hAnsi="Times New Roman" w:cs="Times New Roman"/>
-          <w:sz w:val="22"/>
-          <w:szCs w:val="22"/>
-        </w:rPr>
-        <w:tab/>
-      </w:r>
-      <w:r>
-        <w:rPr>
-          <w:rFonts w:ascii="Times New Roman" w:hAnsi="Times New Roman" w:cs="Times New Roman"/>
-          <w:sz w:val="22"/>
-          <w:szCs w:val="22"/>
-        </w:rPr>
-        <w:tab/>
-      </w:r>
-      <w:r>
-        <w:rPr>
-          <w:rFonts w:ascii="Times New Roman" w:hAnsi="Times New Roman" w:cs="Times New Roman"/>
-          <w:sz w:val="22"/>
-          <w:szCs w:val="22"/>
-        </w:rPr>
-        <w:tab/>
-      </w:r>
-      <w:r>
-        <w:rPr>
-          <w:rFonts w:ascii="Times New Roman" w:hAnsi="Times New Roman" w:cs="Times New Roman"/>
-          <w:sz w:val="22"/>
-          <w:szCs w:val="22"/>
-        </w:rPr>
-        <w:tab/>
-      </w:r>
-      <w:r>
-        <w:rPr>
-          <w:rFonts w:ascii="Times New Roman" w:hAnsi="Times New Roman" w:cs="Times New Roman"/>
-          <w:i/>
-          <w:iCs/>
-          <w:sz w:val="22"/>
-          <w:szCs w:val="22"/>
-        </w:rPr>
-        <w:t xml:space="preserve">    </w:t>
-      </w:r>
-      <w:r>
-        <w:rPr>
-          <w:rFonts w:ascii="Times New Roman" w:hAnsi="Times New Roman" w:cs="Times New Roman"/>
-          <w:i/>
-          <w:iCs/>
-          <w:sz w:val="22"/>
-          <w:szCs w:val="22"/>
-        </w:rPr>
-        <w:t xml:space="preserve">     </w:t>
-      </w:r>
-      <w:r>
-        <w:rPr>
-          <w:rFonts w:ascii="Times New Roman" w:hAnsi="Times New Roman" w:cs="Times New Roman"/>
-          <w:sz w:val="22"/>
-          <w:szCs w:val="22"/>
-        </w:rPr>
-        <w:t xml:space="preserve"> </w:t>
-      </w:r>
-      <w:r>
-        <w:rPr>
-          <w:rFonts w:ascii="Times New Roman" w:hAnsi="Times New Roman" w:cs="Times New Roman"/>
-          <w:sz w:val="22"/>
-          <w:szCs w:val="22"/>
-        </w:rPr>
-        <w:t xml:space="preserve"> </w:t>
-      </w:r>
-      <w:r>
-        <w:rPr>
-          <w:rFonts w:ascii="Times New Roman" w:hAnsi="Times New Roman" w:cs="Times New Roman"/>
-          <w:sz w:val="22"/>
-          <w:szCs w:val="22"/>
-        </w:rPr>
-        <w:t xml:space="preserve"> </w:t>
-      </w:r>
-      <w:r>
-        <w:rPr>
-          <w:rFonts w:ascii="Times New Roman" w:hAnsi="Times New Roman" w:cs="Times New Roman"/>
-          <w:sz w:val="22"/>
-          <w:szCs w:val="22"/>
-        </w:rPr>
-        <w:t>July</w:t>
-      </w:r>
-      <w:r>
-        <w:rPr>
-          <w:rFonts w:ascii="Times New Roman" w:hAnsi="Times New Roman" w:cs="Times New Roman"/>
-          <w:i/>
-          <w:iCs/>
-          <w:sz w:val="22"/>
-          <w:szCs w:val="22"/>
-        </w:rPr>
-        <w:t xml:space="preserve"> </w:t>
-      </w:r>
-      <w:r>
-        <w:rPr>
-          <w:rFonts w:ascii="Times New Roman" w:hAnsi="Times New Roman" w:cs="Times New Roman"/>
-          <w:sz w:val="22"/>
-          <w:szCs w:val="22"/>
-        </w:rPr>
-        <w:t>2022</w:t>
-      </w:r>
-      <w:r>
-        <w:rPr>
-          <w:rFonts w:ascii="Times New Roman" w:hAnsi="Times New Roman" w:cs="Times New Roman"/>
-          <w:sz w:val="22"/>
-          <w:szCs w:val="22"/>
-        </w:rPr>
-        <w:t xml:space="preserve"> </w:t>
-      </w:r>
-      <w:r>
-        <w:rPr>
-          <w:rFonts w:ascii="Times New Roman" w:hAnsi="Times New Roman" w:cs="Times New Roman"/>
-          <w:sz w:val="22"/>
-          <w:szCs w:val="22"/>
-        </w:rPr>
-        <w:t>-</w:t>
-      </w:r>
-      <w:r>
-        <w:rPr>
-          <w:rFonts w:ascii="Times New Roman" w:hAnsi="Times New Roman" w:cs="Times New Roman"/>
-          <w:sz w:val="22"/>
-          <w:szCs w:val="22"/>
-        </w:rPr>
-        <w:t xml:space="preserve"> </w:t>
-      </w:r>
-      <w:r>
-        <w:rPr>
-          <w:rFonts w:ascii="Times New Roman" w:hAnsi="Times New Roman" w:cs="Times New Roman"/>
-          <w:sz w:val="22"/>
-          <w:szCs w:val="22"/>
-        </w:rPr>
-        <w:t xml:space="preserve">October </w:t>
-      </w:r>
-      <w:r>
-        <w:rPr>
-          <w:rFonts w:ascii="Times New Roman" w:hAnsi="Times New Roman" w:cs="Times New Roman"/>
-          <w:sz w:val="22"/>
-          <w:szCs w:val="22"/>
-        </w:rPr>
-        <w:t xml:space="preserve">2022 </w:t>
+          <w:rFonts w:ascii="Times New Roman" w:hAnsi="Times New Roman" w:hint="eastAsia"/>
+          <w:sz w:val="22"/>
+        </w:rPr>
+        <w:t xml:space="preserve">                                                                                         </w:t>
+      </w:r>
+      <w:r>
+        <w:rPr>
+          <w:rFonts w:ascii="Times New Roman" w:hAnsi="Times New Roman"/>
+          <w:sz w:val="22"/>
+        </w:rPr>
+        <w:t>Jan 2026 - Present</w:t>
       </w:r>
     </w:p>
     <w:p>
@@ -1049,19 +921,10 @@
       </w:pPr>
       <w:r>
         <w:rPr>
-          <w:rFonts w:ascii="Times New Roman" w:hAnsi="Times New Roman" w:cs="Times New Roman"/>
-          <w:sz w:val="22"/>
-          <w:szCs w:val="22"/>
-        </w:rPr>
-        <w:t xml:space="preserve">Built </w:t>
-      </w:r>
-      <w:r>
-        <w:rPr>
-          <w:rFonts w:ascii="Times New Roman" w:hAnsi="Times New Roman" w:cs="Times New Roman" w:hint="eastAsia"/>
-          <w:sz w:val="22"/>
-          <w:szCs w:val="22"/>
-        </w:rPr>
-        <w:t xml:space="preserve">a dataset of industrial components with noisy backgrounds, enabling robust training pipelines. </w:t>
+          <w:rFonts w:ascii="Times New Roman" w:hAnsi="Times New Roman"/>
+          <w:sz w:val="22"/>
+        </w:rPr>
+        <w:t>Built AI benchmark with expert-crafted math problems and leaderboard UI.</w:t>
       </w:r>
     </w:p>
     <w:p>
@@ -1081,11 +944,137 @@
       </w:pPr>
       <w:r>
         <w:rPr>
-          <w:rFonts w:ascii="Times New Roman" w:hAnsi="Times New Roman" w:cs="Times New Roman" w:hint="eastAsia"/>
-          <w:sz w:val="22"/>
-          <w:szCs w:val="22"/>
-        </w:rPr>
-        <w:t>Developed a mutual information maximization based unsupervised image segmentation algorithm.</w:t>
+          <w:rFonts w:ascii="Times New Roman" w:hAnsi="Times New Roman"/>
+          <w:sz w:val="22"/>
+        </w:rPr>
+        <w:t>Developed 3D asset rendering and text-to-image data generation pipeline.</w:t>
+      </w:r>
+    </w:p>
+    <w:p>
+      <w:pPr>
+        <w:rPr>
+          <w:rFonts w:ascii="Times New Roman" w:hAnsi="Times New Roman" w:cs="Times New Roman"/>
+          <w:sz w:val="22"/>
+          <w:szCs w:val="22"/>
+        </w:rPr>
+      </w:pPr>
+    </w:p>
+    <w:p>
+      <w:pPr>
+        <w:rPr>
+          <w:rFonts w:ascii="Times New Roman" w:hAnsi="Times New Roman" w:cs="Times New Roman"/>
+          <w:sz w:val="22"/>
+          <w:szCs w:val="22"/>
+        </w:rPr>
+      </w:pPr>
+      <w:r>
+        <w:rPr>
+          <w:rFonts w:ascii="Times New Roman" w:hAnsi="Times New Roman"/>
+          <w:sz w:val="22"/>
+        </w:rPr>
+        <w:t>CARNEGIE MELLON UNIVERSITY</w:t>
+      </w:r>
+      <w:r>
+        <w:rPr>
+          <w:rFonts w:ascii="Times New Roman" w:hAnsi="Times New Roman"/>
+          <w:sz w:val="22"/>
+        </w:rPr>
+        <w:tab/>
+      </w:r>
+      <w:r>
+        <w:rPr>
+          <w:rFonts w:ascii="Times New Roman" w:hAnsi="Times New Roman"/>
+          <w:sz w:val="22"/>
+        </w:rPr>
+        <w:tab/>
+      </w:r>
+      <w:r>
+        <w:rPr>
+          <w:rFonts w:ascii="Times New Roman" w:hAnsi="Times New Roman"/>
+          <w:sz w:val="22"/>
+        </w:rPr>
+        <w:tab/>
+      </w:r>
+      <w:r>
+        <w:rPr>
+          <w:rFonts w:ascii="Times New Roman" w:hAnsi="Times New Roman"/>
+          <w:sz w:val="22"/>
+        </w:rPr>
+        <w:tab/>
+      </w:r>
+      <w:r>
+        <w:rPr>
+          <w:rFonts w:ascii="Times New Roman" w:hAnsi="Times New Roman"/>
+          <w:sz w:val="22"/>
+        </w:rPr>
+        <w:tab/>
+      </w:r>
+      <w:r>
+        <w:rPr>
+          <w:rFonts w:ascii="Times New Roman" w:hAnsi="Times New Roman"/>
+          <w:sz w:val="22"/>
+        </w:rPr>
+        <w:tab/>
+      </w:r>
+      <w:r>
+        <w:rPr>
+          <w:rFonts w:ascii="Times New Roman" w:hAnsi="Times New Roman"/>
+          <w:sz w:val="22"/>
+        </w:rPr>
+        <w:tab/>
+      </w:r>
+      <w:r>
+        <w:rPr>
+          <w:rFonts w:ascii="Times New Roman" w:hAnsi="Times New Roman" w:hint="eastAsia"/>
+          <w:sz w:val="22"/>
+        </w:rPr>
+        <w:t xml:space="preserve">  </w:t>
+      </w:r>
+      <w:r>
+        <w:rPr>
+          <w:rFonts w:ascii="Times New Roman" w:hAnsi="Times New Roman"/>
+          <w:sz w:val="22"/>
+        </w:rPr>
+        <w:t>Pittsburgh, PA</w:t>
+      </w:r>
+    </w:p>
+    <w:p>
+      <w:pPr>
+        <w:jc w:val="distribute"/>
+        <w:rPr>
+          <w:rFonts w:ascii="Times New Roman" w:hAnsi="Times New Roman" w:cs="Times New Roman"/>
+          <w:sz w:val="22"/>
+          <w:szCs w:val="22"/>
+        </w:rPr>
+      </w:pPr>
+      <w:r>
+        <w:rPr>
+          <w:rFonts w:ascii="Times New Roman" w:hAnsi="Times New Roman"/>
+          <w:i/>
+          <w:sz w:val="22"/>
+        </w:rPr>
+        <w:t>Research Associate</w:t>
+      </w:r>
+      <w:r>
+        <w:rPr>
+          <w:rFonts w:ascii="Times New Roman" w:hAnsi="Times New Roman"/>
+          <w:sz w:val="22"/>
+        </w:rPr>
+        <w:tab/>
+      </w:r>
+      <w:r>
+        <w:rPr>
+          <w:rFonts w:ascii="Times New Roman" w:hAnsi="Times New Roman" w:hint="eastAsia"/>
+          <w:sz w:val="22"/>
+        </w:rPr>
+        <w:t xml:space="preserve">                                                                                                  </w:t>
+      </w:r>
+      <w:r>
+        <w:rPr>
+          <w:rFonts w:ascii="Times New Roman" w:hAnsi="Times New Roman"/>
+          <w:sz w:val="22"/>
+        </w:rPr>
+        <w:t>Jan 2024 - Dec 2025</w:t>
       </w:r>
     </w:p>
     <w:p>
@@ -1105,6 +1094,516 @@
       </w:pPr>
       <w:r>
         <w:rPr>
+          <w:rFonts w:ascii="Times New Roman" w:hAnsi="Times New Roman"/>
+          <w:sz w:val="22"/>
+        </w:rPr>
+        <w:t>Multi-object dynamic reconstruction and physics estimation via differentiable simulation.</w:t>
+      </w:r>
+    </w:p>
+    <w:p>
+      <w:pPr>
+        <w:pStyle w:val="ListParagraph"/>
+        <w:numPr>
+          <w:ilvl w:val="0"/>
+          <w:numId w:val="5"/>
+        </w:numPr>
+        <w:ind w:left="714" w:hanging="357"/>
+        <w:jc w:val="both"/>
+        <w:rPr>
+          <w:rFonts w:ascii="Times New Roman" w:hAnsi="Times New Roman" w:cs="Times New Roman"/>
+          <w:sz w:val="22"/>
+          <w:szCs w:val="22"/>
+        </w:rPr>
+      </w:pPr>
+      <w:r>
+        <w:rPr>
+          <w:rFonts w:ascii="Times New Roman" w:hAnsi="Times New Roman"/>
+          <w:sz w:val="22"/>
+        </w:rPr>
+        <w:t>Material-agnostic dynamic reconstruction with neural constitutive models.</w:t>
+      </w:r>
+    </w:p>
+    <w:p>
+      <w:pPr>
+        <w:pStyle w:val="ListParagraph"/>
+        <w:numPr>
+          <w:ilvl w:val="0"/>
+          <w:numId w:val="5"/>
+        </w:numPr>
+        <w:ind w:left="714" w:hanging="357"/>
+        <w:jc w:val="both"/>
+        <w:rPr>
+          <w:rFonts w:ascii="Times New Roman" w:hAnsi="Times New Roman" w:cs="Times New Roman"/>
+          <w:sz w:val="22"/>
+          <w:szCs w:val="22"/>
+        </w:rPr>
+      </w:pPr>
+      <w:r>
+        <w:rPr>
+          <w:rFonts w:ascii="Times New Roman" w:hAnsi="Times New Roman"/>
+          <w:sz w:val="22"/>
+        </w:rPr>
+        <w:t>Head avatar editing with joint appearance, motion, and lighting control.</w:t>
+      </w:r>
+    </w:p>
+    <w:p>
+      <w:pPr>
+        <w:rPr>
+          <w:rFonts w:ascii="Times New Roman" w:hAnsi="Times New Roman" w:cs="Times New Roman"/>
+          <w:sz w:val="22"/>
+          <w:szCs w:val="22"/>
+        </w:rPr>
+      </w:pPr>
+    </w:p>
+    <w:p>
+      <w:pPr>
+        <w:rPr>
+          <w:rFonts w:ascii="Times New Roman" w:hAnsi="Times New Roman" w:cs="Times New Roman"/>
+          <w:sz w:val="22"/>
+          <w:szCs w:val="22"/>
+        </w:rPr>
+      </w:pPr>
+      <w:r>
+        <w:rPr>
+          <w:rFonts w:ascii="Times New Roman" w:hAnsi="Times New Roman"/>
+          <w:sz w:val="22"/>
+        </w:rPr>
+        <w:t>YINZCAM INC.</w:t>
+      </w:r>
+      <w:r>
+        <w:rPr>
+          <w:rFonts w:ascii="Times New Roman" w:hAnsi="Times New Roman"/>
+          <w:sz w:val="22"/>
+        </w:rPr>
+        <w:tab/>
+      </w:r>
+      <w:r>
+        <w:rPr>
+          <w:rFonts w:ascii="Times New Roman" w:hAnsi="Times New Roman" w:hint="eastAsia"/>
+          <w:sz w:val="22"/>
+        </w:rPr>
+        <w:t xml:space="preserve">                                                                                                           </w:t>
+      </w:r>
+      <w:r>
+        <w:rPr>
+          <w:rFonts w:ascii="Times New Roman" w:hAnsi="Times New Roman"/>
+          <w:sz w:val="22"/>
+        </w:rPr>
+        <w:t>Pittsburgh, PA</w:t>
+      </w:r>
+    </w:p>
+    <w:p>
+      <w:pPr>
+        <w:jc w:val="distribute"/>
+        <w:rPr>
+          <w:rFonts w:ascii="Times New Roman" w:hAnsi="Times New Roman" w:cs="Times New Roman"/>
+          <w:sz w:val="22"/>
+          <w:szCs w:val="22"/>
+        </w:rPr>
+      </w:pPr>
+      <w:r>
+        <w:rPr>
+          <w:rFonts w:ascii="Times New Roman" w:hAnsi="Times New Roman"/>
+          <w:i/>
+          <w:sz w:val="22"/>
+        </w:rPr>
+        <w:t>Research Intern</w:t>
+      </w:r>
+      <w:r>
+        <w:rPr>
+          <w:rFonts w:ascii="Times New Roman" w:hAnsi="Times New Roman"/>
+          <w:sz w:val="22"/>
+        </w:rPr>
+        <w:tab/>
+      </w:r>
+      <w:r>
+        <w:rPr>
+          <w:rFonts w:ascii="Times New Roman" w:hAnsi="Times New Roman" w:hint="eastAsia"/>
+          <w:sz w:val="22"/>
+        </w:rPr>
+        <w:t xml:space="preserve">                                                                                                             </w:t>
+      </w:r>
+      <w:r>
+        <w:rPr>
+          <w:rFonts w:ascii="Times New Roman" w:hAnsi="Times New Roman"/>
+          <w:sz w:val="22"/>
+        </w:rPr>
+        <w:t>May 2023 - Aug 2023</w:t>
+      </w:r>
+    </w:p>
+    <w:p>
+      <w:pPr>
+        <w:pStyle w:val="ListParagraph"/>
+        <w:numPr>
+          <w:ilvl w:val="0"/>
+          <w:numId w:val="5"/>
+        </w:numPr>
+        <w:ind w:left="714" w:hanging="357"/>
+        <w:jc w:val="both"/>
+        <w:rPr>
+          <w:rFonts w:ascii="Times New Roman" w:hAnsi="Times New Roman" w:cs="Times New Roman"/>
+          <w:sz w:val="22"/>
+          <w:szCs w:val="22"/>
+        </w:rPr>
+      </w:pPr>
+      <w:r>
+        <w:rPr>
+          <w:rFonts w:ascii="Times New Roman" w:hAnsi="Times New Roman"/>
+          <w:sz w:val="22"/>
+        </w:rPr>
+        <w:t>Built real-time data collection and analysis system for esports players, synchronizing in-game telemetry (health, armor, KDA) with biometric streams (eye tracking, heart rate, wrist gestures, body posture).</w:t>
+      </w:r>
+    </w:p>
+    <w:p>
+      <w:pPr>
+        <w:pStyle w:val="ListParagraph"/>
+        <w:numPr>
+          <w:ilvl w:val="0"/>
+          <w:numId w:val="5"/>
+        </w:numPr>
+        <w:ind w:left="714" w:hanging="357"/>
+        <w:jc w:val="both"/>
+        <w:rPr>
+          <w:rFonts w:ascii="Times New Roman" w:hAnsi="Times New Roman" w:cs="Times New Roman"/>
+          <w:sz w:val="22"/>
+          <w:szCs w:val="22"/>
+        </w:rPr>
+      </w:pPr>
+      <w:r>
+        <w:rPr>
+          <w:rFonts w:ascii="Times New Roman" w:hAnsi="Times New Roman"/>
+          <w:sz w:val="22"/>
+        </w:rPr>
+      </w:r>
+    </w:p>
+    <w:p>
+      <w:pPr>
+        <w:rPr>
+          <w:rFonts w:ascii="Times New Roman" w:hAnsi="Times New Roman" w:cs="Times New Roman"/>
+          <w:sz w:val="22"/>
+          <w:szCs w:val="22"/>
+        </w:rPr>
+      </w:pPr>
+    </w:p>
+    <w:p>
+      <w:pPr>
+        <w:rPr>
+          <w:rFonts w:ascii="Times New Roman" w:hAnsi="Times New Roman" w:cs="Times New Roman"/>
+          <w:sz w:val="22"/>
+          <w:szCs w:val="22"/>
+        </w:rPr>
+      </w:pPr>
+      <w:r>
+        <w:rPr>
+          <w:rFonts w:ascii="Times New Roman" w:hAnsi="Times New Roman" w:cs="Times New Roman"/>
+          <w:sz w:val="22"/>
+          <w:szCs w:val="22"/>
+        </w:rPr>
+        <w:t>YAMAHA MOTOR SOLUTIONS CO., LTD. XIAMEN</w:t>
+      </w:r>
+      <w:r>
+        <w:rPr>
+          <w:rFonts w:ascii="Times New Roman" w:hAnsi="Times New Roman" w:cs="Times New Roman"/>
+          <w:sz w:val="22"/>
+          <w:szCs w:val="22"/>
+        </w:rPr>
+        <w:tab/>
+      </w:r>
+      <w:r>
+        <w:rPr>
+          <w:rFonts w:ascii="Times New Roman" w:hAnsi="Times New Roman" w:cs="Times New Roman"/>
+          <w:sz w:val="22"/>
+          <w:szCs w:val="22"/>
+        </w:rPr>
+        <w:tab/>
+      </w:r>
+      <w:r>
+        <w:rPr>
+          <w:rFonts w:ascii="Times New Roman" w:hAnsi="Times New Roman" w:cs="Times New Roman"/>
+          <w:sz w:val="22"/>
+          <w:szCs w:val="22"/>
+        </w:rPr>
+        <w:tab/>
+        <w:t xml:space="preserve">            </w:t>
+      </w:r>
+      <w:r>
+        <w:rPr>
+          <w:rFonts w:ascii="Times New Roman" w:hAnsi="Times New Roman" w:cs="Times New Roman"/>
+          <w:sz w:val="22"/>
+          <w:szCs w:val="22"/>
+        </w:rPr>
+        <w:t xml:space="preserve">   </w:t>
+      </w:r>
+      <w:r>
+        <w:rPr>
+          <w:rFonts w:ascii="Times New Roman" w:hAnsi="Times New Roman" w:cs="Times New Roman"/>
+          <w:sz w:val="22"/>
+          <w:szCs w:val="22"/>
+        </w:rPr>
+        <w:t>Xiamen,</w:t>
+      </w:r>
+      <w:r>
+        <w:rPr>
+          <w:rFonts w:ascii="Times New Roman" w:hAnsi="Times New Roman" w:cs="Times New Roman" w:hint="eastAsia"/>
+          <w:sz w:val="22"/>
+          <w:szCs w:val="22"/>
+        </w:rPr>
+        <w:t xml:space="preserve"> </w:t>
+      </w:r>
+      <w:r>
+        <w:rPr>
+          <w:rFonts w:ascii="Times New Roman" w:hAnsi="Times New Roman" w:cs="Times New Roman"/>
+          <w:sz w:val="22"/>
+          <w:szCs w:val="22"/>
+        </w:rPr>
+        <w:t>China</w:t>
+      </w:r>
+    </w:p>
+    <w:p>
+      <w:pPr>
+        <w:jc w:val="distribute"/>
+        <w:rPr>
+          <w:rFonts w:ascii="Times New Roman" w:hAnsi="Times New Roman" w:cs="Times New Roman"/>
+          <w:sz w:val="22"/>
+          <w:szCs w:val="22"/>
+        </w:rPr>
+      </w:pPr>
+      <w:r>
+        <w:rPr>
+          <w:rFonts w:ascii="Times New Roman" w:hAnsi="Times New Roman" w:cs="Times New Roman"/>
+          <w:i/>
+          <w:iCs/>
+          <w:sz w:val="22"/>
+          <w:szCs w:val="22"/>
+        </w:rPr>
+        <w:t xml:space="preserve">Innovation Center Intern                       </w:t>
+      </w:r>
+      <w:r>
+        <w:rPr>
+          <w:rFonts w:ascii="Times New Roman" w:hAnsi="Times New Roman" w:cs="Times New Roman"/>
+          <w:i/>
+          <w:iCs/>
+          <w:sz w:val="22"/>
+          <w:szCs w:val="22"/>
+        </w:rPr>
+        <w:tab/>
+      </w:r>
+      <w:r>
+        <w:rPr>
+          <w:rFonts w:ascii="Times New Roman" w:hAnsi="Times New Roman" w:cs="Times New Roman"/>
+          <w:sz w:val="22"/>
+          <w:szCs w:val="22"/>
+        </w:rPr>
+        <w:tab/>
+      </w:r>
+      <w:r>
+        <w:rPr>
+          <w:rFonts w:ascii="Times New Roman" w:hAnsi="Times New Roman" w:cs="Times New Roman"/>
+          <w:sz w:val="22"/>
+          <w:szCs w:val="22"/>
+        </w:rPr>
+        <w:tab/>
+      </w:r>
+      <w:r>
+        <w:rPr>
+          <w:rFonts w:ascii="Times New Roman" w:hAnsi="Times New Roman" w:cs="Times New Roman"/>
+          <w:sz w:val="22"/>
+          <w:szCs w:val="22"/>
+        </w:rPr>
+        <w:tab/>
+      </w:r>
+      <w:r>
+        <w:rPr>
+          <w:rFonts w:ascii="Times New Roman" w:hAnsi="Times New Roman" w:cs="Times New Roman"/>
+          <w:sz w:val="22"/>
+          <w:szCs w:val="22"/>
+        </w:rPr>
+        <w:tab/>
+      </w:r>
+      <w:r>
+        <w:rPr>
+          <w:rFonts w:ascii="Times New Roman" w:hAnsi="Times New Roman" w:cs="Times New Roman"/>
+          <w:i/>
+          <w:iCs/>
+          <w:sz w:val="22"/>
+          <w:szCs w:val="22"/>
+        </w:rPr>
+        <w:t xml:space="preserve">    </w:t>
+      </w:r>
+      <w:r>
+        <w:rPr>
+          <w:rFonts w:ascii="Times New Roman" w:hAnsi="Times New Roman" w:cs="Times New Roman"/>
+          <w:i/>
+          <w:iCs/>
+          <w:sz w:val="22"/>
+          <w:szCs w:val="22"/>
+        </w:rPr>
+        <w:t xml:space="preserve">     </w:t>
+      </w:r>
+      <w:r>
+        <w:rPr>
+          <w:rFonts w:ascii="Times New Roman" w:hAnsi="Times New Roman" w:cs="Times New Roman"/>
+          <w:sz w:val="22"/>
+          <w:szCs w:val="22"/>
+        </w:rPr>
+        <w:t xml:space="preserve"> </w:t>
+      </w:r>
+      <w:r>
+        <w:rPr>
+          <w:rFonts w:ascii="Times New Roman" w:hAnsi="Times New Roman" w:cs="Times New Roman"/>
+          <w:sz w:val="22"/>
+          <w:szCs w:val="22"/>
+        </w:rPr>
+        <w:t xml:space="preserve"> </w:t>
+      </w:r>
+      <w:r>
+        <w:rPr>
+          <w:rFonts w:ascii="Times New Roman" w:hAnsi="Times New Roman" w:cs="Times New Roman"/>
+          <w:sz w:val="22"/>
+          <w:szCs w:val="22"/>
+        </w:rPr>
+        <w:t xml:space="preserve"> </w:t>
+      </w:r>
+      <w:r>
+        <w:rPr>
+          <w:rFonts w:ascii="Times New Roman" w:hAnsi="Times New Roman" w:cs="Times New Roman"/>
+          <w:sz w:val="22"/>
+          <w:szCs w:val="22"/>
+        </w:rPr>
+        <w:t>July</w:t>
+      </w:r>
+      <w:r>
+        <w:rPr>
+          <w:rFonts w:ascii="Times New Roman" w:hAnsi="Times New Roman" w:cs="Times New Roman"/>
+          <w:i/>
+          <w:iCs/>
+          <w:sz w:val="22"/>
+          <w:szCs w:val="22"/>
+        </w:rPr>
+        <w:t xml:space="preserve"> </w:t>
+      </w:r>
+      <w:r>
+        <w:rPr>
+          <w:rFonts w:ascii="Times New Roman" w:hAnsi="Times New Roman" w:cs="Times New Roman"/>
+          <w:sz w:val="22"/>
+          <w:szCs w:val="22"/>
+        </w:rPr>
+        <w:t>2022</w:t>
+      </w:r>
+      <w:r>
+        <w:rPr>
+          <w:rFonts w:ascii="Times New Roman" w:hAnsi="Times New Roman" w:cs="Times New Roman"/>
+          <w:sz w:val="22"/>
+          <w:szCs w:val="22"/>
+        </w:rPr>
+        <w:t xml:space="preserve"> </w:t>
+      </w:r>
+      <w:r>
+        <w:rPr>
+          <w:rFonts w:ascii="Times New Roman" w:hAnsi="Times New Roman" w:cs="Times New Roman"/>
+          <w:sz w:val="22"/>
+          <w:szCs w:val="22"/>
+        </w:rPr>
+        <w:t>-</w:t>
+      </w:r>
+      <w:r>
+        <w:rPr>
+          <w:rFonts w:ascii="Times New Roman" w:hAnsi="Times New Roman" w:cs="Times New Roman"/>
+          <w:sz w:val="22"/>
+          <w:szCs w:val="22"/>
+        </w:rPr>
+        <w:t xml:space="preserve"> </w:t>
+      </w:r>
+      <w:r>
+        <w:rPr>
+          <w:rFonts w:ascii="Times New Roman" w:hAnsi="Times New Roman" w:cs="Times New Roman"/>
+          <w:sz w:val="22"/>
+          <w:szCs w:val="22"/>
+        </w:rPr>
+        <w:t xml:space="preserve">October </w:t>
+      </w:r>
+      <w:r>
+        <w:rPr>
+          <w:rFonts w:ascii="Times New Roman" w:hAnsi="Times New Roman" w:cs="Times New Roman"/>
+          <w:sz w:val="22"/>
+          <w:szCs w:val="22"/>
+        </w:rPr>
+        <w:t xml:space="preserve">2022 </w:t>
+      </w:r>
+    </w:p>
+    <w:p>
+      <w:pPr>
+        <w:pStyle w:val="ListParagraph"/>
+        <w:numPr>
+          <w:ilvl w:val="0"/>
+          <w:numId w:val="5"/>
+        </w:numPr>
+        <w:ind w:left="714" w:hanging="357"/>
+        <w:jc w:val="both"/>
+        <w:rPr>
+          <w:rFonts w:ascii="Times New Roman" w:hAnsi="Times New Roman" w:cs="Times New Roman"/>
+          <w:sz w:val="22"/>
+          <w:szCs w:val="22"/>
+        </w:rPr>
+      </w:pPr>
+      <w:r>
+        <w:rPr>
+          <w:rFonts w:ascii="Times New Roman" w:hAnsi="Times New Roman" w:cs="Times New Roman"/>
+          <w:sz w:val="22"/>
+          <w:szCs w:val="22"/>
+        </w:rPr>
+        <w:t xml:space="preserve">Built </w:t>
+      </w:r>
+      <w:r>
+        <w:rPr>
+          <w:rFonts w:ascii="Times New Roman" w:hAnsi="Times New Roman" w:cs="Times New Roman" w:hint="eastAsia"/>
+          <w:sz w:val="22"/>
+          <w:szCs w:val="22"/>
+        </w:rPr>
+        <w:t xml:space="preserve">a dataset of industrial components with noisy backgrounds, enabling robust training pipelines. </w:t>
+      </w:r>
+    </w:p>
+    <w:p>
+      <w:pPr>
+        <w:pStyle w:val="ListParagraph"/>
+        <w:numPr>
+          <w:ilvl w:val="0"/>
+          <w:numId w:val="5"/>
+        </w:numPr>
+        <w:ind w:left="714" w:hanging="357"/>
+        <w:jc w:val="both"/>
+        <w:rPr>
+          <w:rFonts w:ascii="Times New Roman" w:hAnsi="Times New Roman" w:cs="Times New Roman"/>
+          <w:sz w:val="22"/>
+          <w:szCs w:val="22"/>
+        </w:rPr>
+      </w:pPr>
+      <w:r>
+        <w:rPr>
+          <w:rFonts w:ascii="Times New Roman" w:hAnsi="Times New Roman" w:cs="Times New Roman" w:hint="eastAsia"/>
+          <w:sz w:val="22"/>
+          <w:szCs w:val="22"/>
+        </w:rPr>
+        <w:t>Developed a mutual information maximization based unsupervised image segmentation algorithm.</w:t>
+      </w:r>
+    </w:p>
+    <w:p>
+      <w:pPr>
+        <w:pStyle w:val="ListParagraph"/>
+        <w:numPr>
+          <w:ilvl w:val="0"/>
+          <w:numId w:val="5"/>
+        </w:numPr>
+        <w:ind w:left="714" w:hanging="357"/>
+        <w:jc w:val="both"/>
+        <w:rPr>
+          <w:rFonts w:ascii="Times New Roman" w:hAnsi="Times New Roman" w:cs="Times New Roman"/>
+          <w:sz w:val="22"/>
+          <w:szCs w:val="22"/>
+        </w:rPr>
+      </w:pPr>
+      <w:r>
+        <w:rPr>
           <w:rFonts w:ascii="Times New Roman" w:hAnsi="Times New Roman" w:cs="Times New Roman" w:hint="eastAsia"/>
           <w:sz w:val="22"/>
           <w:szCs w:val="22"/>
@@ -1903,6 +2402,7 @@
           <w:sz w:val="22"/>
           <w:szCs w:val="22"/>
         </w:rPr>
+        <w:lastRenderedPageBreak/>
         <w:t xml:space="preserve">Couse Project       </w:t>
       </w:r>
       <w:r>

</xml_diff>

<commit_message>
Optimize mobile layout and update content
- Add JS device detection hook (is-mobile/is-tablet/is-desktop)
- Improve responsive CSS for phone and tablet viewports
- Remove (MASIV) from publication title
- Update resume with revised project descriptions

Co-Authored-By: Claude Opus 4.6 <noreply@anthropic.com>
</commit_message>
<xml_diff>
--- a/assets/Chunjiang Liu Resume.docx
+++ b/assets/Chunjiang Liu Resume.docx
@@ -442,6 +442,7 @@
         </w:rPr>
         <w:t xml:space="preserve"> (</w:t>
       </w:r>
+      <w:proofErr w:type="gramStart"/>
       <w:r>
         <w:rPr>
           <w:rFonts w:ascii="Times New Roman" w:hAnsi="Times New Roman" w:cs="Times New Roman"/>
@@ -462,7 +463,20 @@
           <w:szCs w:val="22"/>
           <w:shd w:val="clear" w:color="auto" w:fill="FFFFFF"/>
         </w:rPr>
-        <w:t xml:space="preserve">             </w:t>
+        <w:t xml:space="preserve"> </w:t>
+      </w:r>
+      <w:proofErr w:type="gramEnd"/>
+      <w:r>
+        <w:rPr>
+          <w:rFonts w:ascii="Times New Roman" w:hAnsi="Times New Roman" w:cs="Times New Roman"/>
+          <w:b/>
+          <w:bCs/>
+          <w:color w:val="000000"/>
+          <w:sz w:val="22"/>
+          <w:szCs w:val="22"/>
+          <w:shd w:val="clear" w:color="auto" w:fill="FFFFFF"/>
+        </w:rPr>
+        <w:t xml:space="preserve">            </w:t>
       </w:r>
       <w:r>
         <w:rPr>
@@ -924,7 +938,7 @@
           <w:rFonts w:ascii="Times New Roman" w:hAnsi="Times New Roman"/>
           <w:sz w:val="22"/>
         </w:rPr>
-        <w:t>Built AI benchmark with expert-crafted math problems and leaderboard UI.</w:t>
+        <w:t>1Bench: A living benchmark platform for evaluating frontier AI models.</w:t>
       </w:r>
     </w:p>
     <w:p>
@@ -947,134 +961,7 @@
           <w:rFonts w:ascii="Times New Roman" w:hAnsi="Times New Roman"/>
           <w:sz w:val="22"/>
         </w:rPr>
-        <w:t>Developed 3D asset rendering and text-to-image data generation pipeline.</w:t>
-      </w:r>
-    </w:p>
-    <w:p>
-      <w:pPr>
-        <w:rPr>
-          <w:rFonts w:ascii="Times New Roman" w:hAnsi="Times New Roman" w:cs="Times New Roman"/>
-          <w:sz w:val="22"/>
-          <w:szCs w:val="22"/>
-        </w:rPr>
-      </w:pPr>
-    </w:p>
-    <w:p>
-      <w:pPr>
-        <w:rPr>
-          <w:rFonts w:ascii="Times New Roman" w:hAnsi="Times New Roman" w:cs="Times New Roman"/>
-          <w:sz w:val="22"/>
-          <w:szCs w:val="22"/>
-        </w:rPr>
-      </w:pPr>
-      <w:r>
-        <w:rPr>
-          <w:rFonts w:ascii="Times New Roman" w:hAnsi="Times New Roman"/>
-          <w:sz w:val="22"/>
-        </w:rPr>
-        <w:t>CARNEGIE MELLON UNIVERSITY</w:t>
-      </w:r>
-      <w:r>
-        <w:rPr>
-          <w:rFonts w:ascii="Times New Roman" w:hAnsi="Times New Roman"/>
-          <w:sz w:val="22"/>
-        </w:rPr>
-        <w:tab/>
-      </w:r>
-      <w:r>
-        <w:rPr>
-          <w:rFonts w:ascii="Times New Roman" w:hAnsi="Times New Roman"/>
-          <w:sz w:val="22"/>
-        </w:rPr>
-        <w:tab/>
-      </w:r>
-      <w:r>
-        <w:rPr>
-          <w:rFonts w:ascii="Times New Roman" w:hAnsi="Times New Roman"/>
-          <w:sz w:val="22"/>
-        </w:rPr>
-        <w:tab/>
-      </w:r>
-      <w:r>
-        <w:rPr>
-          <w:rFonts w:ascii="Times New Roman" w:hAnsi="Times New Roman"/>
-          <w:sz w:val="22"/>
-        </w:rPr>
-        <w:tab/>
-      </w:r>
-      <w:r>
-        <w:rPr>
-          <w:rFonts w:ascii="Times New Roman" w:hAnsi="Times New Roman"/>
-          <w:sz w:val="22"/>
-        </w:rPr>
-        <w:tab/>
-      </w:r>
-      <w:r>
-        <w:rPr>
-          <w:rFonts w:ascii="Times New Roman" w:hAnsi="Times New Roman"/>
-          <w:sz w:val="22"/>
-        </w:rPr>
-        <w:tab/>
-      </w:r>
-      <w:r>
-        <w:rPr>
-          <w:rFonts w:ascii="Times New Roman" w:hAnsi="Times New Roman"/>
-          <w:sz w:val="22"/>
-        </w:rPr>
-        <w:tab/>
-      </w:r>
-      <w:r>
-        <w:rPr>
-          <w:rFonts w:ascii="Times New Roman" w:hAnsi="Times New Roman" w:hint="eastAsia"/>
-          <w:sz w:val="22"/>
-        </w:rPr>
-        <w:t xml:space="preserve">  </w:t>
-      </w:r>
-      <w:r>
-        <w:rPr>
-          <w:rFonts w:ascii="Times New Roman" w:hAnsi="Times New Roman"/>
-          <w:sz w:val="22"/>
-        </w:rPr>
-        <w:t>Pittsburgh, PA</w:t>
-      </w:r>
-    </w:p>
-    <w:p>
-      <w:pPr>
-        <w:jc w:val="distribute"/>
-        <w:rPr>
-          <w:rFonts w:ascii="Times New Roman" w:hAnsi="Times New Roman" w:cs="Times New Roman"/>
-          <w:sz w:val="22"/>
-          <w:szCs w:val="22"/>
-        </w:rPr>
-      </w:pPr>
-      <w:r>
-        <w:rPr>
-          <w:rFonts w:ascii="Times New Roman" w:hAnsi="Times New Roman"/>
-          <w:i/>
-          <w:sz w:val="22"/>
-        </w:rPr>
-        <w:t>Research Associate</w:t>
-      </w:r>
-      <w:r>
-        <w:rPr>
-          <w:rFonts w:ascii="Times New Roman" w:hAnsi="Times New Roman"/>
-          <w:sz w:val="22"/>
-        </w:rPr>
-        <w:tab/>
-      </w:r>
-      <w:r>
-        <w:rPr>
-          <w:rFonts w:ascii="Times New Roman" w:hAnsi="Times New Roman" w:hint="eastAsia"/>
-          <w:sz w:val="22"/>
-        </w:rPr>
-        <w:t xml:space="preserve">                                                                                                  </w:t>
-      </w:r>
-      <w:r>
-        <w:rPr>
-          <w:rFonts w:ascii="Times New Roman" w:hAnsi="Times New Roman"/>
-          <w:sz w:val="22"/>
-        </w:rPr>
-        <w:t>Jan 2024 - Dec 2025</w:t>
+        <w:t>Designed and built interactive leaderboard UI and benchmark platform with Next.js.</w:t>
       </w:r>
     </w:p>
     <w:p>
@@ -1097,7 +984,7 @@
           <w:rFonts w:ascii="Times New Roman" w:hAnsi="Times New Roman"/>
           <w:sz w:val="22"/>
         </w:rPr>
-        <w:t>Multi-object dynamic reconstruction and physics estimation via differentiable simulation.</w:t>
+        <w:t>ArtArena: A visual aesthetic benchmark for AI model evaluation.</w:t>
       </w:r>
     </w:p>
     <w:p>
@@ -1120,7 +1007,154 @@
           <w:rFonts w:ascii="Times New Roman" w:hAnsi="Times New Roman"/>
           <w:sz w:val="22"/>
         </w:rPr>
-        <w:t>Material-agnostic dynamic reconstruction with neural constitutive models.</w:t>
+        <w:t>Built 3D rendering and text-to-image data pipelines for artist-curated evaluation sets.</w:t>
+      </w:r>
+      <w:hyperlink r:id="rId10">
+        <w:r>
+          <w:rPr>
+            <w:rFonts w:ascii="Times New Roman" w:hAnsi="Times New Roman"/>
+            <w:color w:val="0563C1"/>
+            <w:u w:val="single"/>
+            <w:sz w:val="22"/>
+          </w:rPr>
+          <w:t xml:space="preserve"> [link]</w:t>
+        </w:r>
+      </w:hyperlink>
+    </w:p>
+    <w:p>
+      <w:pPr>
+        <w:rPr>
+          <w:rFonts w:ascii="Times New Roman" w:hAnsi="Times New Roman" w:cs="Times New Roman"/>
+          <w:sz w:val="22"/>
+          <w:szCs w:val="22"/>
+        </w:rPr>
+      </w:pPr>
+    </w:p>
+    <w:p>
+      <w:pPr>
+        <w:rPr>
+          <w:rFonts w:ascii="Times New Roman" w:hAnsi="Times New Roman" w:cs="Times New Roman"/>
+          <w:sz w:val="22"/>
+          <w:szCs w:val="22"/>
+        </w:rPr>
+      </w:pPr>
+      <w:r>
+        <w:rPr>
+          <w:rFonts w:ascii="Times New Roman" w:hAnsi="Times New Roman"/>
+          <w:sz w:val="22"/>
+        </w:rPr>
+        <w:t>CARNEGIE MELLON UNIVERSITY</w:t>
+      </w:r>
+      <w:r>
+        <w:rPr>
+          <w:rFonts w:ascii="Times New Roman" w:hAnsi="Times New Roman"/>
+          <w:sz w:val="22"/>
+        </w:rPr>
+        <w:tab/>
+      </w:r>
+      <w:r>
+        <w:rPr>
+          <w:rFonts w:ascii="Times New Roman" w:hAnsi="Times New Roman"/>
+          <w:sz w:val="22"/>
+        </w:rPr>
+        <w:tab/>
+      </w:r>
+      <w:r>
+        <w:rPr>
+          <w:rFonts w:ascii="Times New Roman" w:hAnsi="Times New Roman"/>
+          <w:sz w:val="22"/>
+        </w:rPr>
+        <w:tab/>
+      </w:r>
+      <w:r>
+        <w:rPr>
+          <w:rFonts w:ascii="Times New Roman" w:hAnsi="Times New Roman"/>
+          <w:sz w:val="22"/>
+        </w:rPr>
+        <w:tab/>
+      </w:r>
+      <w:r>
+        <w:rPr>
+          <w:rFonts w:ascii="Times New Roman" w:hAnsi="Times New Roman"/>
+          <w:sz w:val="22"/>
+        </w:rPr>
+        <w:tab/>
+      </w:r>
+      <w:r>
+        <w:rPr>
+          <w:rFonts w:ascii="Times New Roman" w:hAnsi="Times New Roman"/>
+          <w:sz w:val="22"/>
+        </w:rPr>
+        <w:tab/>
+      </w:r>
+      <w:proofErr w:type="gramStart"/>
+      <w:r>
+        <w:rPr>
+          <w:rFonts w:ascii="Times New Roman" w:hAnsi="Times New Roman"/>
+          <w:sz w:val="22"/>
+        </w:rPr>
+        <w:tab/>
+      </w:r>
+      <w:r>
+        <w:rPr>
+          <w:rFonts w:ascii="Times New Roman" w:hAnsi="Times New Roman" w:hint="eastAsia"/>
+          <w:sz w:val="22"/>
+        </w:rPr>
+        <w:t xml:space="preserve">  </w:t>
+      </w:r>
+      <w:r>
+        <w:rPr>
+          <w:rFonts w:ascii="Times New Roman" w:hAnsi="Times New Roman"/>
+          <w:sz w:val="22"/>
+        </w:rPr>
+        <w:t>Pittsburgh</w:t>
+      </w:r>
+      <w:proofErr w:type="gramEnd"/>
+      <w:r>
+        <w:rPr>
+          <w:rFonts w:ascii="Times New Roman" w:hAnsi="Times New Roman"/>
+          <w:sz w:val="22"/>
+        </w:rPr>
+        <w:t>, PA</w:t>
+      </w:r>
+    </w:p>
+    <w:p>
+      <w:pPr>
+        <w:jc w:val="distribute"/>
+        <w:rPr>
+          <w:rFonts w:ascii="Times New Roman" w:hAnsi="Times New Roman" w:cs="Times New Roman"/>
+          <w:sz w:val="22"/>
+          <w:szCs w:val="22"/>
+        </w:rPr>
+      </w:pPr>
+      <w:r>
+        <w:rPr>
+          <w:rFonts w:ascii="Times New Roman" w:hAnsi="Times New Roman"/>
+          <w:i/>
+          <w:sz w:val="22"/>
+        </w:rPr>
+        <w:t>Research Associate</w:t>
+      </w:r>
+      <w:r>
+        <w:rPr>
+          <w:rFonts w:ascii="Times New Roman" w:hAnsi="Times New Roman"/>
+          <w:sz w:val="22"/>
+        </w:rPr>
+        <w:tab/>
+      </w:r>
+      <w:r>
+        <w:rPr>
+          <w:rFonts w:ascii="Times New Roman" w:hAnsi="Times New Roman" w:hint="eastAsia"/>
+          <w:sz w:val="22"/>
+        </w:rPr>
+        <w:t xml:space="preserve">                                                                                                  </w:t>
+      </w:r>
+      <w:r>
+        <w:rPr>
+          <w:rFonts w:ascii="Times New Roman" w:hAnsi="Times New Roman"/>
+          <w:sz w:val="22"/>
+        </w:rPr>
+        <w:t>Jan 2024 - Dec 2025</w:t>
       </w:r>
     </w:p>
     <w:p>
@@ -1143,92 +1177,7 @@
           <w:rFonts w:ascii="Times New Roman" w:hAnsi="Times New Roman"/>
           <w:sz w:val="22"/>
         </w:rPr>
-        <w:t>Head avatar editing with joint appearance, motion, and lighting control.</w:t>
-      </w:r>
-    </w:p>
-    <w:p>
-      <w:pPr>
-        <w:rPr>
-          <w:rFonts w:ascii="Times New Roman" w:hAnsi="Times New Roman" w:cs="Times New Roman"/>
-          <w:sz w:val="22"/>
-          <w:szCs w:val="22"/>
-        </w:rPr>
-      </w:pPr>
-    </w:p>
-    <w:p>
-      <w:pPr>
-        <w:rPr>
-          <w:rFonts w:ascii="Times New Roman" w:hAnsi="Times New Roman" w:cs="Times New Roman"/>
-          <w:sz w:val="22"/>
-          <w:szCs w:val="22"/>
-        </w:rPr>
-      </w:pPr>
-      <w:r>
-        <w:rPr>
-          <w:rFonts w:ascii="Times New Roman" w:hAnsi="Times New Roman"/>
-          <w:sz w:val="22"/>
-        </w:rPr>
-        <w:t>YINZCAM INC.</w:t>
-      </w:r>
-      <w:r>
-        <w:rPr>
-          <w:rFonts w:ascii="Times New Roman" w:hAnsi="Times New Roman"/>
-          <w:sz w:val="22"/>
-        </w:rPr>
-        <w:tab/>
-      </w:r>
-      <w:r>
-        <w:rPr>
-          <w:rFonts w:ascii="Times New Roman" w:hAnsi="Times New Roman" w:hint="eastAsia"/>
-          <w:sz w:val="22"/>
-        </w:rPr>
-        <w:t xml:space="preserve">                                                                                                           </w:t>
-      </w:r>
-      <w:r>
-        <w:rPr>
-          <w:rFonts w:ascii="Times New Roman" w:hAnsi="Times New Roman"/>
-          <w:sz w:val="22"/>
-        </w:rPr>
-        <w:t>Pittsburgh, PA</w:t>
-      </w:r>
-    </w:p>
-    <w:p>
-      <w:pPr>
-        <w:jc w:val="distribute"/>
-        <w:rPr>
-          <w:rFonts w:ascii="Times New Roman" w:hAnsi="Times New Roman" w:cs="Times New Roman"/>
-          <w:sz w:val="22"/>
-          <w:szCs w:val="22"/>
-        </w:rPr>
-      </w:pPr>
-      <w:r>
-        <w:rPr>
-          <w:rFonts w:ascii="Times New Roman" w:hAnsi="Times New Roman"/>
-          <w:i/>
-          <w:sz w:val="22"/>
-        </w:rPr>
-        <w:t>Research Intern</w:t>
-      </w:r>
-      <w:r>
-        <w:rPr>
-          <w:rFonts w:ascii="Times New Roman" w:hAnsi="Times New Roman"/>
-          <w:sz w:val="22"/>
-        </w:rPr>
-        <w:tab/>
-      </w:r>
-      <w:r>
-        <w:rPr>
-          <w:rFonts w:ascii="Times New Roman" w:hAnsi="Times New Roman" w:hint="eastAsia"/>
-          <w:sz w:val="22"/>
-        </w:rPr>
-        <w:t xml:space="preserve">                                                                                                             </w:t>
-      </w:r>
-      <w:r>
-        <w:rPr>
-          <w:rFonts w:ascii="Times New Roman" w:hAnsi="Times New Roman"/>
-          <w:sz w:val="22"/>
-        </w:rPr>
-        <w:t>May 2023 - Aug 2023</w:t>
+        <w:t>Multi-object dynamic reconstruction and physics estimation via differentiable simulation.</w:t>
       </w:r>
     </w:p>
     <w:p>
@@ -1251,7 +1200,7 @@
           <w:rFonts w:ascii="Times New Roman" w:hAnsi="Times New Roman"/>
           <w:sz w:val="22"/>
         </w:rPr>
-        <w:t>Built real-time data collection and analysis system for esports players, synchronizing in-game telemetry (health, armor, KDA) with biometric streams (eye tracking, heart rate, wrist gestures, body posture).</w:t>
+        <w:t>Material-agnostic dynamic reconstruction with neural constitutive models.</w:t>
       </w:r>
     </w:p>
     <w:p>
@@ -1274,261 +1223,92 @@
           <w:rFonts w:ascii="Times New Roman" w:hAnsi="Times New Roman"/>
           <w:sz w:val="22"/>
         </w:rPr>
-      </w:r>
-    </w:p>
-    <w:p>
-      <w:pPr>
-        <w:rPr>
-          <w:rFonts w:ascii="Times New Roman" w:hAnsi="Times New Roman" w:cs="Times New Roman"/>
-          <w:sz w:val="22"/>
-          <w:szCs w:val="22"/>
-        </w:rPr>
-      </w:pPr>
-    </w:p>
-    <w:p>
-      <w:pPr>
-        <w:rPr>
-          <w:rFonts w:ascii="Times New Roman" w:hAnsi="Times New Roman" w:cs="Times New Roman"/>
-          <w:sz w:val="22"/>
-          <w:szCs w:val="22"/>
-        </w:rPr>
-      </w:pPr>
-      <w:r>
-        <w:rPr>
-          <w:rFonts w:ascii="Times New Roman" w:hAnsi="Times New Roman" w:cs="Times New Roman"/>
-          <w:sz w:val="22"/>
-          <w:szCs w:val="22"/>
-        </w:rPr>
-        <w:t>YAMAHA MOTOR SOLUTIONS CO., LTD. XIAMEN</w:t>
-      </w:r>
-      <w:r>
-        <w:rPr>
-          <w:rFonts w:ascii="Times New Roman" w:hAnsi="Times New Roman" w:cs="Times New Roman"/>
-          <w:sz w:val="22"/>
-          <w:szCs w:val="22"/>
+        <w:t>Head avatar editing with joint appearance, motion, and lighting control.</w:t>
+      </w:r>
+    </w:p>
+    <w:p>
+      <w:pPr>
+        <w:rPr>
+          <w:rFonts w:ascii="Times New Roman" w:hAnsi="Times New Roman" w:cs="Times New Roman"/>
+          <w:sz w:val="22"/>
+          <w:szCs w:val="22"/>
+        </w:rPr>
+      </w:pPr>
+    </w:p>
+    <w:p>
+      <w:pPr>
+        <w:rPr>
+          <w:rFonts w:ascii="Times New Roman" w:hAnsi="Times New Roman" w:cs="Times New Roman"/>
+          <w:sz w:val="22"/>
+          <w:szCs w:val="22"/>
+        </w:rPr>
+      </w:pPr>
+      <w:r>
+        <w:rPr>
+          <w:rFonts w:ascii="Times New Roman" w:hAnsi="Times New Roman"/>
+          <w:sz w:val="22"/>
+        </w:rPr>
+        <w:t>YINZCAM INC.</w:t>
+      </w:r>
+      <w:r>
+        <w:rPr>
+          <w:rFonts w:ascii="Times New Roman" w:hAnsi="Times New Roman"/>
+          <w:sz w:val="22"/>
         </w:rPr>
         <w:tab/>
       </w:r>
       <w:r>
         <w:rPr>
-          <w:rFonts w:ascii="Times New Roman" w:hAnsi="Times New Roman" w:cs="Times New Roman"/>
-          <w:sz w:val="22"/>
-          <w:szCs w:val="22"/>
+          <w:rFonts w:ascii="Times New Roman" w:hAnsi="Times New Roman" w:hint="eastAsia"/>
+          <w:sz w:val="22"/>
+        </w:rPr>
+        <w:t xml:space="preserve">                                                                                                           </w:t>
+      </w:r>
+      <w:r>
+        <w:rPr>
+          <w:rFonts w:ascii="Times New Roman" w:hAnsi="Times New Roman"/>
+          <w:sz w:val="22"/>
+        </w:rPr>
+        <w:t>Pittsburgh, PA</w:t>
+      </w:r>
+    </w:p>
+    <w:p>
+      <w:pPr>
+        <w:jc w:val="distribute"/>
+        <w:rPr>
+          <w:rFonts w:ascii="Times New Roman" w:hAnsi="Times New Roman" w:cs="Times New Roman"/>
+          <w:sz w:val="22"/>
+          <w:szCs w:val="22"/>
+        </w:rPr>
+      </w:pPr>
+      <w:r>
+        <w:rPr>
+          <w:rFonts w:ascii="Times New Roman" w:hAnsi="Times New Roman"/>
+          <w:i/>
+          <w:sz w:val="22"/>
+        </w:rPr>
+        <w:t>Research Intern</w:t>
+      </w:r>
+      <w:r>
+        <w:rPr>
+          <w:rFonts w:ascii="Times New Roman" w:hAnsi="Times New Roman"/>
+          <w:sz w:val="22"/>
         </w:rPr>
         <w:tab/>
       </w:r>
       <w:r>
         <w:rPr>
-          <w:rFonts w:ascii="Times New Roman" w:hAnsi="Times New Roman" w:cs="Times New Roman"/>
-          <w:sz w:val="22"/>
-          <w:szCs w:val="22"/>
-        </w:rPr>
-        <w:tab/>
-        <w:t xml:space="preserve">            </w:t>
-      </w:r>
-      <w:r>
-        <w:rPr>
-          <w:rFonts w:ascii="Times New Roman" w:hAnsi="Times New Roman" w:cs="Times New Roman"/>
-          <w:sz w:val="22"/>
-          <w:szCs w:val="22"/>
-        </w:rPr>
-        <w:t xml:space="preserve">   </w:t>
-      </w:r>
-      <w:r>
-        <w:rPr>
-          <w:rFonts w:ascii="Times New Roman" w:hAnsi="Times New Roman" w:cs="Times New Roman"/>
-          <w:sz w:val="22"/>
-          <w:szCs w:val="22"/>
-        </w:rPr>
-        <w:t>Xiamen,</w:t>
-      </w:r>
-      <w:r>
-        <w:rPr>
-          <w:rFonts w:ascii="Times New Roman" w:hAnsi="Times New Roman" w:cs="Times New Roman" w:hint="eastAsia"/>
-          <w:sz w:val="22"/>
-          <w:szCs w:val="22"/>
-        </w:rPr>
-        <w:t xml:space="preserve"> </w:t>
-      </w:r>
-      <w:r>
-        <w:rPr>
-          <w:rFonts w:ascii="Times New Roman" w:hAnsi="Times New Roman" w:cs="Times New Roman"/>
-          <w:sz w:val="22"/>
-          <w:szCs w:val="22"/>
-        </w:rPr>
-        <w:t>China</w:t>
-      </w:r>
-    </w:p>
-    <w:p>
-      <w:pPr>
-        <w:jc w:val="distribute"/>
-        <w:rPr>
-          <w:rFonts w:ascii="Times New Roman" w:hAnsi="Times New Roman" w:cs="Times New Roman"/>
-          <w:sz w:val="22"/>
-          <w:szCs w:val="22"/>
-        </w:rPr>
-      </w:pPr>
-      <w:r>
-        <w:rPr>
-          <w:rFonts w:ascii="Times New Roman" w:hAnsi="Times New Roman" w:cs="Times New Roman"/>
-          <w:i/>
-          <w:iCs/>
-          <w:sz w:val="22"/>
-          <w:szCs w:val="22"/>
-        </w:rPr>
-        <w:t xml:space="preserve">Innovation Center Intern                       </w:t>
-      </w:r>
-      <w:r>
-        <w:rPr>
-          <w:rFonts w:ascii="Times New Roman" w:hAnsi="Times New Roman" w:cs="Times New Roman"/>
-          <w:i/>
-          <w:iCs/>
-          <w:sz w:val="22"/>
-          <w:szCs w:val="22"/>
-        </w:rPr>
-        <w:tab/>
-      </w:r>
-      <w:r>
-        <w:rPr>
-          <w:rFonts w:ascii="Times New Roman" w:hAnsi="Times New Roman" w:cs="Times New Roman"/>
-          <w:sz w:val="22"/>
-          <w:szCs w:val="22"/>
-        </w:rPr>
-        <w:tab/>
-      </w:r>
-      <w:r>
-        <w:rPr>
-          <w:rFonts w:ascii="Times New Roman" w:hAnsi="Times New Roman" w:cs="Times New Roman"/>
-          <w:sz w:val="22"/>
-          <w:szCs w:val="22"/>
-        </w:rPr>
-        <w:tab/>
-      </w:r>
-      <w:r>
-        <w:rPr>
-          <w:rFonts w:ascii="Times New Roman" w:hAnsi="Times New Roman" w:cs="Times New Roman"/>
-          <w:sz w:val="22"/>
-          <w:szCs w:val="22"/>
-        </w:rPr>
-        <w:tab/>
-      </w:r>
-      <w:r>
-        <w:rPr>
-          <w:rFonts w:ascii="Times New Roman" w:hAnsi="Times New Roman" w:cs="Times New Roman"/>
-          <w:sz w:val="22"/>
-          <w:szCs w:val="22"/>
-        </w:rPr>
-        <w:tab/>
-      </w:r>
-      <w:r>
-        <w:rPr>
-          <w:rFonts w:ascii="Times New Roman" w:hAnsi="Times New Roman" w:cs="Times New Roman"/>
-          <w:i/>
-          <w:iCs/>
-          <w:sz w:val="22"/>
-          <w:szCs w:val="22"/>
-        </w:rPr>
-        <w:t xml:space="preserve">    </w:t>
-      </w:r>
-      <w:r>
-        <w:rPr>
-          <w:rFonts w:ascii="Times New Roman" w:hAnsi="Times New Roman" w:cs="Times New Roman"/>
-          <w:i/>
-          <w:iCs/>
-          <w:sz w:val="22"/>
-          <w:szCs w:val="22"/>
-        </w:rPr>
-        <w:t xml:space="preserve">     </w:t>
-      </w:r>
-      <w:r>
-        <w:rPr>
-          <w:rFonts w:ascii="Times New Roman" w:hAnsi="Times New Roman" w:cs="Times New Roman"/>
-          <w:sz w:val="22"/>
-          <w:szCs w:val="22"/>
-        </w:rPr>
-        <w:t xml:space="preserve"> </w:t>
-      </w:r>
-      <w:r>
-        <w:rPr>
-          <w:rFonts w:ascii="Times New Roman" w:hAnsi="Times New Roman" w:cs="Times New Roman"/>
-          <w:sz w:val="22"/>
-          <w:szCs w:val="22"/>
-        </w:rPr>
-        <w:t xml:space="preserve"> </w:t>
-      </w:r>
-      <w:r>
-        <w:rPr>
-          <w:rFonts w:ascii="Times New Roman" w:hAnsi="Times New Roman" w:cs="Times New Roman"/>
-          <w:sz w:val="22"/>
-          <w:szCs w:val="22"/>
-        </w:rPr>
-        <w:t xml:space="preserve"> </w:t>
-      </w:r>
-      <w:r>
-        <w:rPr>
-          <w:rFonts w:ascii="Times New Roman" w:hAnsi="Times New Roman" w:cs="Times New Roman"/>
-          <w:sz w:val="22"/>
-          <w:szCs w:val="22"/>
-        </w:rPr>
-        <w:t>July</w:t>
-      </w:r>
-      <w:r>
-        <w:rPr>
-          <w:rFonts w:ascii="Times New Roman" w:hAnsi="Times New Roman" w:cs="Times New Roman"/>
-          <w:i/>
-          <w:iCs/>
-          <w:sz w:val="22"/>
-          <w:szCs w:val="22"/>
-        </w:rPr>
-        <w:t xml:space="preserve"> </w:t>
-      </w:r>
-      <w:r>
-        <w:rPr>
-          <w:rFonts w:ascii="Times New Roman" w:hAnsi="Times New Roman" w:cs="Times New Roman"/>
-          <w:sz w:val="22"/>
-          <w:szCs w:val="22"/>
-        </w:rPr>
-        <w:t>2022</w:t>
-      </w:r>
-      <w:r>
-        <w:rPr>
-          <w:rFonts w:ascii="Times New Roman" w:hAnsi="Times New Roman" w:cs="Times New Roman"/>
-          <w:sz w:val="22"/>
-          <w:szCs w:val="22"/>
-        </w:rPr>
-        <w:t xml:space="preserve"> </w:t>
-      </w:r>
-      <w:r>
-        <w:rPr>
-          <w:rFonts w:ascii="Times New Roman" w:hAnsi="Times New Roman" w:cs="Times New Roman"/>
-          <w:sz w:val="22"/>
-          <w:szCs w:val="22"/>
-        </w:rPr>
-        <w:t>-</w:t>
-      </w:r>
-      <w:r>
-        <w:rPr>
-          <w:rFonts w:ascii="Times New Roman" w:hAnsi="Times New Roman" w:cs="Times New Roman"/>
-          <w:sz w:val="22"/>
-          <w:szCs w:val="22"/>
-        </w:rPr>
-        <w:t xml:space="preserve"> </w:t>
-      </w:r>
-      <w:r>
-        <w:rPr>
-          <w:rFonts w:ascii="Times New Roman" w:hAnsi="Times New Roman" w:cs="Times New Roman"/>
-          <w:sz w:val="22"/>
-          <w:szCs w:val="22"/>
-        </w:rPr>
-        <w:t xml:space="preserve">October </w:t>
-      </w:r>
-      <w:r>
-        <w:rPr>
-          <w:rFonts w:ascii="Times New Roman" w:hAnsi="Times New Roman" w:cs="Times New Roman"/>
-          <w:sz w:val="22"/>
-          <w:szCs w:val="22"/>
-        </w:rPr>
-        <w:t xml:space="preserve">2022 </w:t>
+          <w:rFonts w:ascii="Times New Roman" w:hAnsi="Times New Roman" w:hint="eastAsia"/>
+          <w:sz w:val="22"/>
+        </w:rPr>
+        <w:t xml:space="preserve">                                                                                                             </w:t>
+      </w:r>
+      <w:r>
+        <w:rPr>
+          <w:rFonts w:ascii="Times New Roman" w:hAnsi="Times New Roman"/>
+          <w:sz w:val="22"/>
+        </w:rPr>
+        <w:t>May 2023 - Aug 2023</w:t>
       </w:r>
     </w:p>
     <w:p>
@@ -1548,19 +1328,10 @@
       </w:pPr>
       <w:r>
         <w:rPr>
-          <w:rFonts w:ascii="Times New Roman" w:hAnsi="Times New Roman" w:cs="Times New Roman"/>
-          <w:sz w:val="22"/>
-          <w:szCs w:val="22"/>
-        </w:rPr>
-        <w:t xml:space="preserve">Built </w:t>
-      </w:r>
-      <w:r>
-        <w:rPr>
-          <w:rFonts w:ascii="Times New Roman" w:hAnsi="Times New Roman" w:cs="Times New Roman" w:hint="eastAsia"/>
-          <w:sz w:val="22"/>
-          <w:szCs w:val="22"/>
-        </w:rPr>
-        <w:t xml:space="preserve">a dataset of industrial components with noisy backgrounds, enabling robust training pipelines. </w:t>
+          <w:rFonts w:ascii="Times New Roman" w:hAnsi="Times New Roman"/>
+          <w:sz w:val="22"/>
+        </w:rPr>
+        <w:t>Built real-time data collection and analysis system for esports players</w:t>
       </w:r>
     </w:p>
     <w:p>
@@ -1580,11 +1351,23 @@
       </w:pPr>
       <w:r>
         <w:rPr>
-          <w:rFonts w:ascii="Times New Roman" w:hAnsi="Times New Roman" w:cs="Times New Roman" w:hint="eastAsia"/>
-          <w:sz w:val="22"/>
-          <w:szCs w:val="22"/>
-        </w:rPr>
-        <w:t>Developed a mutual information maximization based unsupervised image segmentation algorithm.</w:t>
+          <w:rFonts w:ascii="Times New Roman" w:hAnsi="Times New Roman" w:cs="Times New Roman"/>
+          <w:color w:val="000000"/>
+          <w:sz w:val="22"/>
+          <w:szCs w:val="22"/>
+          <w:shd w:val="clear" w:color="auto" w:fill="FAFAFA"/>
+        </w:rPr>
+        <w:t>Synchronized in-game telemetry: health, armor</w:t>
+      </w:r>
+      <w:r>
+        <w:rPr>
+          <w:rFonts w:ascii="Times New Roman" w:hAnsi="Times New Roman" w:cs="Times New Roman" w:hint="eastAsia"/>
+          <w:color w:val="000000"/>
+          <w:sz w:val="22"/>
+          <w:szCs w:val="22"/>
+          <w:shd w:val="clear" w:color="auto" w:fill="FAFAFA"/>
+        </w:rPr>
+        <w:t xml:space="preserve"> and KDA.</w:t>
       </w:r>
     </w:p>
     <w:p>
@@ -1604,6 +1387,363 @@
       </w:pPr>
       <w:r>
         <w:rPr>
+          <w:rFonts w:ascii="Times New Roman" w:hAnsi="Times New Roman" w:cs="Times New Roman"/>
+          <w:color w:val="000000"/>
+          <w:sz w:val="22"/>
+          <w:szCs w:val="22"/>
+          <w:shd w:val="clear" w:color="auto" w:fill="FAFAFA"/>
+        </w:rPr>
+        <w:t>Synchronized biometric streams Captured: ye tracking, heart rate, wrist gestures, and body posture</w:t>
+      </w:r>
+      <w:r>
+        <w:rPr>
+          <w:rFonts w:ascii="Times New Roman" w:hAnsi="Times New Roman" w:cs="Times New Roman" w:hint="eastAsia"/>
+          <w:color w:val="000000"/>
+          <w:sz w:val="22"/>
+          <w:szCs w:val="22"/>
+          <w:shd w:val="clear" w:color="auto" w:fill="FAFAFA"/>
+        </w:rPr>
+        <w:t>.</w:t>
+      </w:r>
+    </w:p>
+    <w:p>
+      <w:pPr>
+        <w:rPr>
+          <w:rFonts w:ascii="Times New Roman" w:hAnsi="Times New Roman" w:cs="Times New Roman"/>
+          <w:sz w:val="22"/>
+          <w:szCs w:val="22"/>
+        </w:rPr>
+      </w:pPr>
+    </w:p>
+    <w:p>
+      <w:pPr>
+        <w:rPr>
+          <w:rFonts w:ascii="Times New Roman" w:hAnsi="Times New Roman" w:cs="Times New Roman"/>
+          <w:sz w:val="22"/>
+          <w:szCs w:val="22"/>
+        </w:rPr>
+      </w:pPr>
+      <w:r>
+        <w:rPr>
+          <w:rFonts w:ascii="Times New Roman" w:hAnsi="Times New Roman" w:cs="Times New Roman"/>
+          <w:sz w:val="22"/>
+          <w:szCs w:val="22"/>
+        </w:rPr>
+        <w:t>YAMAHA MOTOR SOLUTIONS CO., LTD. XIAMEN</w:t>
+      </w:r>
+      <w:r>
+        <w:rPr>
+          <w:rFonts w:ascii="Times New Roman" w:hAnsi="Times New Roman" w:cs="Times New Roman"/>
+          <w:sz w:val="22"/>
+          <w:szCs w:val="22"/>
+        </w:rPr>
+        <w:tab/>
+      </w:r>
+      <w:r>
+        <w:rPr>
+          <w:rFonts w:ascii="Times New Roman" w:hAnsi="Times New Roman" w:cs="Times New Roman"/>
+          <w:sz w:val="22"/>
+          <w:szCs w:val="22"/>
+        </w:rPr>
+        <w:tab/>
+      </w:r>
+      <w:r>
+        <w:rPr>
+          <w:rFonts w:ascii="Times New Roman" w:hAnsi="Times New Roman" w:cs="Times New Roman"/>
+          <w:sz w:val="22"/>
+          <w:szCs w:val="22"/>
+        </w:rPr>
+        <w:tab/>
+        <w:t xml:space="preserve">            </w:t>
+      </w:r>
+      <w:r>
+        <w:rPr>
+          <w:rFonts w:ascii="Times New Roman" w:hAnsi="Times New Roman" w:cs="Times New Roman"/>
+          <w:sz w:val="22"/>
+          <w:szCs w:val="22"/>
+        </w:rPr>
+        <w:t xml:space="preserve">   </w:t>
+      </w:r>
+      <w:proofErr w:type="spellStart"/>
+      <w:r>
+        <w:rPr>
+          <w:rFonts w:ascii="Times New Roman" w:hAnsi="Times New Roman" w:cs="Times New Roman"/>
+          <w:sz w:val="22"/>
+          <w:szCs w:val="22"/>
+        </w:rPr>
+        <w:t>Xiamen</w:t>
+      </w:r>
+      <w:proofErr w:type="spellEnd"/>
+      <w:r>
+        <w:rPr>
+          <w:rFonts w:ascii="Times New Roman" w:hAnsi="Times New Roman" w:cs="Times New Roman"/>
+          <w:sz w:val="22"/>
+          <w:szCs w:val="22"/>
+        </w:rPr>
+        <w:t>,</w:t>
+      </w:r>
+      <w:r>
+        <w:rPr>
+          <w:rFonts w:ascii="Times New Roman" w:hAnsi="Times New Roman" w:cs="Times New Roman" w:hint="eastAsia"/>
+          <w:sz w:val="22"/>
+          <w:szCs w:val="22"/>
+        </w:rPr>
+        <w:t xml:space="preserve"> </w:t>
+      </w:r>
+      <w:r>
+        <w:rPr>
+          <w:rFonts w:ascii="Times New Roman" w:hAnsi="Times New Roman" w:cs="Times New Roman"/>
+          <w:sz w:val="22"/>
+          <w:szCs w:val="22"/>
+        </w:rPr>
+        <w:t>China</w:t>
+      </w:r>
+    </w:p>
+    <w:p>
+      <w:pPr>
+        <w:jc w:val="distribute"/>
+        <w:rPr>
+          <w:rFonts w:ascii="Times New Roman" w:hAnsi="Times New Roman" w:cs="Times New Roman"/>
+          <w:sz w:val="22"/>
+          <w:szCs w:val="22"/>
+        </w:rPr>
+      </w:pPr>
+      <w:r>
+        <w:rPr>
+          <w:rFonts w:ascii="Times New Roman" w:hAnsi="Times New Roman" w:cs="Times New Roman"/>
+          <w:i/>
+          <w:iCs/>
+          <w:sz w:val="22"/>
+          <w:szCs w:val="22"/>
+        </w:rPr>
+        <w:t xml:space="preserve">Innovation Center Intern                       </w:t>
+      </w:r>
+      <w:r>
+        <w:rPr>
+          <w:rFonts w:ascii="Times New Roman" w:hAnsi="Times New Roman" w:cs="Times New Roman"/>
+          <w:i/>
+          <w:iCs/>
+          <w:sz w:val="22"/>
+          <w:szCs w:val="22"/>
+        </w:rPr>
+        <w:tab/>
+      </w:r>
+      <w:r>
+        <w:rPr>
+          <w:rFonts w:ascii="Times New Roman" w:hAnsi="Times New Roman" w:cs="Times New Roman"/>
+          <w:sz w:val="22"/>
+          <w:szCs w:val="22"/>
+        </w:rPr>
+        <w:tab/>
+      </w:r>
+      <w:r>
+        <w:rPr>
+          <w:rFonts w:ascii="Times New Roman" w:hAnsi="Times New Roman" w:cs="Times New Roman"/>
+          <w:sz w:val="22"/>
+          <w:szCs w:val="22"/>
+        </w:rPr>
+        <w:tab/>
+      </w:r>
+      <w:r>
+        <w:rPr>
+          <w:rFonts w:ascii="Times New Roman" w:hAnsi="Times New Roman" w:cs="Times New Roman"/>
+          <w:sz w:val="22"/>
+          <w:szCs w:val="22"/>
+        </w:rPr>
+        <w:tab/>
+      </w:r>
+      <w:r>
+        <w:rPr>
+          <w:rFonts w:ascii="Times New Roman" w:hAnsi="Times New Roman" w:cs="Times New Roman"/>
+          <w:sz w:val="22"/>
+          <w:szCs w:val="22"/>
+        </w:rPr>
+        <w:tab/>
+      </w:r>
+      <w:r>
+        <w:rPr>
+          <w:rFonts w:ascii="Times New Roman" w:hAnsi="Times New Roman" w:cs="Times New Roman"/>
+          <w:i/>
+          <w:iCs/>
+          <w:sz w:val="22"/>
+          <w:szCs w:val="22"/>
+        </w:rPr>
+        <w:t xml:space="preserve">    </w:t>
+      </w:r>
+      <w:r>
+        <w:rPr>
+          <w:rFonts w:ascii="Times New Roman" w:hAnsi="Times New Roman" w:cs="Times New Roman"/>
+          <w:i/>
+          <w:iCs/>
+          <w:sz w:val="22"/>
+          <w:szCs w:val="22"/>
+        </w:rPr>
+        <w:t xml:space="preserve">     </w:t>
+      </w:r>
+      <w:r>
+        <w:rPr>
+          <w:rFonts w:ascii="Times New Roman" w:hAnsi="Times New Roman" w:cs="Times New Roman"/>
+          <w:sz w:val="22"/>
+          <w:szCs w:val="22"/>
+        </w:rPr>
+        <w:t xml:space="preserve"> </w:t>
+      </w:r>
+      <w:r>
+        <w:rPr>
+          <w:rFonts w:ascii="Times New Roman" w:hAnsi="Times New Roman" w:cs="Times New Roman"/>
+          <w:sz w:val="22"/>
+          <w:szCs w:val="22"/>
+        </w:rPr>
+        <w:t xml:space="preserve"> </w:t>
+      </w:r>
+      <w:r>
+        <w:rPr>
+          <w:rFonts w:ascii="Times New Roman" w:hAnsi="Times New Roman" w:cs="Times New Roman"/>
+          <w:sz w:val="22"/>
+          <w:szCs w:val="22"/>
+        </w:rPr>
+        <w:t xml:space="preserve"> </w:t>
+      </w:r>
+      <w:r>
+        <w:rPr>
+          <w:rFonts w:ascii="Times New Roman" w:hAnsi="Times New Roman" w:cs="Times New Roman"/>
+          <w:sz w:val="22"/>
+          <w:szCs w:val="22"/>
+        </w:rPr>
+        <w:t>July</w:t>
+      </w:r>
+      <w:r>
+        <w:rPr>
+          <w:rFonts w:ascii="Times New Roman" w:hAnsi="Times New Roman" w:cs="Times New Roman"/>
+          <w:i/>
+          <w:iCs/>
+          <w:sz w:val="22"/>
+          <w:szCs w:val="22"/>
+        </w:rPr>
+        <w:t xml:space="preserve"> </w:t>
+      </w:r>
+      <w:r>
+        <w:rPr>
+          <w:rFonts w:ascii="Times New Roman" w:hAnsi="Times New Roman" w:cs="Times New Roman"/>
+          <w:sz w:val="22"/>
+          <w:szCs w:val="22"/>
+        </w:rPr>
+        <w:t>2022</w:t>
+      </w:r>
+      <w:r>
+        <w:rPr>
+          <w:rFonts w:ascii="Times New Roman" w:hAnsi="Times New Roman" w:cs="Times New Roman"/>
+          <w:sz w:val="22"/>
+          <w:szCs w:val="22"/>
+        </w:rPr>
+        <w:t xml:space="preserve"> </w:t>
+      </w:r>
+      <w:r>
+        <w:rPr>
+          <w:rFonts w:ascii="Times New Roman" w:hAnsi="Times New Roman" w:cs="Times New Roman"/>
+          <w:sz w:val="22"/>
+          <w:szCs w:val="22"/>
+        </w:rPr>
+        <w:t>-</w:t>
+      </w:r>
+      <w:r>
+        <w:rPr>
+          <w:rFonts w:ascii="Times New Roman" w:hAnsi="Times New Roman" w:cs="Times New Roman"/>
+          <w:sz w:val="22"/>
+          <w:szCs w:val="22"/>
+        </w:rPr>
+        <w:t xml:space="preserve"> </w:t>
+      </w:r>
+      <w:r>
+        <w:rPr>
+          <w:rFonts w:ascii="Times New Roman" w:hAnsi="Times New Roman" w:cs="Times New Roman"/>
+          <w:sz w:val="22"/>
+          <w:szCs w:val="22"/>
+        </w:rPr>
+        <w:t xml:space="preserve">October </w:t>
+      </w:r>
+      <w:r>
+        <w:rPr>
+          <w:rFonts w:ascii="Times New Roman" w:hAnsi="Times New Roman" w:cs="Times New Roman"/>
+          <w:sz w:val="22"/>
+          <w:szCs w:val="22"/>
+        </w:rPr>
+        <w:t xml:space="preserve">2022 </w:t>
+      </w:r>
+    </w:p>
+    <w:p>
+      <w:pPr>
+        <w:pStyle w:val="ListParagraph"/>
+        <w:numPr>
+          <w:ilvl w:val="0"/>
+          <w:numId w:val="5"/>
+        </w:numPr>
+        <w:ind w:left="714" w:hanging="357"/>
+        <w:jc w:val="both"/>
+        <w:rPr>
+          <w:rFonts w:ascii="Times New Roman" w:hAnsi="Times New Roman" w:cs="Times New Roman"/>
+          <w:sz w:val="22"/>
+          <w:szCs w:val="22"/>
+        </w:rPr>
+      </w:pPr>
+      <w:r>
+        <w:rPr>
+          <w:rFonts w:ascii="Times New Roman" w:hAnsi="Times New Roman" w:cs="Times New Roman"/>
+          <w:sz w:val="22"/>
+          <w:szCs w:val="22"/>
+        </w:rPr>
+        <w:t xml:space="preserve">Built </w:t>
+      </w:r>
+      <w:r>
+        <w:rPr>
+          <w:rFonts w:ascii="Times New Roman" w:hAnsi="Times New Roman" w:cs="Times New Roman" w:hint="eastAsia"/>
+          <w:sz w:val="22"/>
+          <w:szCs w:val="22"/>
+        </w:rPr>
+        <w:t xml:space="preserve">a dataset of industrial components with noisy backgrounds, enabling robust training pipelines. </w:t>
+      </w:r>
+    </w:p>
+    <w:p>
+      <w:pPr>
+        <w:pStyle w:val="ListParagraph"/>
+        <w:numPr>
+          <w:ilvl w:val="0"/>
+          <w:numId w:val="5"/>
+        </w:numPr>
+        <w:ind w:left="714" w:hanging="357"/>
+        <w:jc w:val="both"/>
+        <w:rPr>
+          <w:rFonts w:ascii="Times New Roman" w:hAnsi="Times New Roman" w:cs="Times New Roman"/>
+          <w:sz w:val="22"/>
+          <w:szCs w:val="22"/>
+        </w:rPr>
+      </w:pPr>
+      <w:r>
+        <w:rPr>
+          <w:rFonts w:ascii="Times New Roman" w:hAnsi="Times New Roman" w:cs="Times New Roman" w:hint="eastAsia"/>
+          <w:sz w:val="22"/>
+          <w:szCs w:val="22"/>
+        </w:rPr>
+        <w:t>Developed a mutual information maximization based unsupervised image segmentation algorithm.</w:t>
+      </w:r>
+    </w:p>
+    <w:p>
+      <w:pPr>
+        <w:pStyle w:val="ListParagraph"/>
+        <w:numPr>
+          <w:ilvl w:val="0"/>
+          <w:numId w:val="5"/>
+        </w:numPr>
+        <w:ind w:left="714" w:hanging="357"/>
+        <w:jc w:val="both"/>
+        <w:rPr>
+          <w:rFonts w:ascii="Times New Roman" w:hAnsi="Times New Roman" w:cs="Times New Roman"/>
+          <w:sz w:val="22"/>
+          <w:szCs w:val="22"/>
+        </w:rPr>
+      </w:pPr>
+      <w:r>
+        <w:rPr>
           <w:rFonts w:ascii="Times New Roman" w:hAnsi="Times New Roman" w:cs="Times New Roman" w:hint="eastAsia"/>
           <w:sz w:val="22"/>
           <w:szCs w:val="22"/>
@@ -2343,6 +2483,7 @@
           <w:sz w:val="22"/>
           <w:szCs w:val="22"/>
         </w:rPr>
+        <w:lastRenderedPageBreak/>
         <w:t xml:space="preserve">Stage-Aware </w:t>
       </w:r>
       <w:r>
@@ -2402,7 +2543,6 @@
           <w:sz w:val="22"/>
           <w:szCs w:val="22"/>
         </w:rPr>
-        <w:lastRenderedPageBreak/>
         <w:t xml:space="preserve">Couse Project       </w:t>
       </w:r>
       <w:r>
@@ -2599,7 +2739,43 @@
           <w:sz w:val="22"/>
           <w:szCs w:val="22"/>
         </w:rPr>
-        <w:t>, Haoyu Chen, Bhiksha Raj, Min Xu, Tadas Baltrusaitis, Mitch Rundle, HsiangTao Wu, Kamran Ghasedi</w:t>
+        <w:t xml:space="preserve">, Haoyu Chen, </w:t>
+      </w:r>
+      <w:proofErr w:type="spellStart"/>
+      <w:r>
+        <w:rPr>
+          <w:rFonts w:ascii="Times New Roman" w:hAnsi="Times New Roman" w:cs="Times New Roman"/>
+          <w:sz w:val="22"/>
+          <w:szCs w:val="22"/>
+        </w:rPr>
+        <w:t>Bhiksha</w:t>
+      </w:r>
+      <w:proofErr w:type="spellEnd"/>
+      <w:r>
+        <w:rPr>
+          <w:rFonts w:ascii="Times New Roman" w:hAnsi="Times New Roman" w:cs="Times New Roman"/>
+          <w:sz w:val="22"/>
+          <w:szCs w:val="22"/>
+        </w:rPr>
+        <w:t xml:space="preserve"> Raj, Min Xu, Tadas Baltrusaitis, Mitch Rundle, </w:t>
+      </w:r>
+      <w:proofErr w:type="spellStart"/>
+      <w:r>
+        <w:rPr>
+          <w:rFonts w:ascii="Times New Roman" w:hAnsi="Times New Roman" w:cs="Times New Roman"/>
+          <w:sz w:val="22"/>
+          <w:szCs w:val="22"/>
+        </w:rPr>
+        <w:t>HsiangTao</w:t>
+      </w:r>
+      <w:proofErr w:type="spellEnd"/>
+      <w:r>
+        <w:rPr>
+          <w:rFonts w:ascii="Times New Roman" w:hAnsi="Times New Roman" w:cs="Times New Roman"/>
+          <w:sz w:val="22"/>
+          <w:szCs w:val="22"/>
+        </w:rPr>
+        <w:t xml:space="preserve"> Wu, Kamran Ghasedi</w:t>
       </w:r>
       <w:r>
         <w:rPr>
@@ -2721,7 +2897,79 @@
           <w:sz w:val="22"/>
           <w:szCs w:val="22"/>
         </w:rPr>
-        <w:t>, Zhenyang Li, Charles Herrmann, Junhwa Hur, Yinxiao Li, Ming-Hsuan Yang, Bhiksha Raj, Min Xu</w:t>
+        <w:t xml:space="preserve">, </w:t>
+      </w:r>
+      <w:proofErr w:type="spellStart"/>
+      <w:r>
+        <w:rPr>
+          <w:rFonts w:ascii="Times New Roman" w:hAnsi="Times New Roman" w:cs="Times New Roman"/>
+          <w:sz w:val="22"/>
+          <w:szCs w:val="22"/>
+        </w:rPr>
+        <w:t>Zhenyang</w:t>
+      </w:r>
+      <w:proofErr w:type="spellEnd"/>
+      <w:r>
+        <w:rPr>
+          <w:rFonts w:ascii="Times New Roman" w:hAnsi="Times New Roman" w:cs="Times New Roman"/>
+          <w:sz w:val="22"/>
+          <w:szCs w:val="22"/>
+        </w:rPr>
+        <w:t xml:space="preserve"> Li, Charles Herrmann, </w:t>
+      </w:r>
+      <w:proofErr w:type="spellStart"/>
+      <w:r>
+        <w:rPr>
+          <w:rFonts w:ascii="Times New Roman" w:hAnsi="Times New Roman" w:cs="Times New Roman"/>
+          <w:sz w:val="22"/>
+          <w:szCs w:val="22"/>
+        </w:rPr>
+        <w:t>Junhwa</w:t>
+      </w:r>
+      <w:proofErr w:type="spellEnd"/>
+      <w:r>
+        <w:rPr>
+          <w:rFonts w:ascii="Times New Roman" w:hAnsi="Times New Roman" w:cs="Times New Roman"/>
+          <w:sz w:val="22"/>
+          <w:szCs w:val="22"/>
+        </w:rPr>
+        <w:t xml:space="preserve"> Hur, </w:t>
+      </w:r>
+      <w:proofErr w:type="spellStart"/>
+      <w:r>
+        <w:rPr>
+          <w:rFonts w:ascii="Times New Roman" w:hAnsi="Times New Roman" w:cs="Times New Roman"/>
+          <w:sz w:val="22"/>
+          <w:szCs w:val="22"/>
+        </w:rPr>
+        <w:t>Yinxiao</w:t>
+      </w:r>
+      <w:proofErr w:type="spellEnd"/>
+      <w:r>
+        <w:rPr>
+          <w:rFonts w:ascii="Times New Roman" w:hAnsi="Times New Roman" w:cs="Times New Roman"/>
+          <w:sz w:val="22"/>
+          <w:szCs w:val="22"/>
+        </w:rPr>
+        <w:t xml:space="preserve"> Li, Ming-Hsuan Yang, </w:t>
+      </w:r>
+      <w:proofErr w:type="spellStart"/>
+      <w:r>
+        <w:rPr>
+          <w:rFonts w:ascii="Times New Roman" w:hAnsi="Times New Roman" w:cs="Times New Roman"/>
+          <w:sz w:val="22"/>
+          <w:szCs w:val="22"/>
+        </w:rPr>
+        <w:t>Bhiksha</w:t>
+      </w:r>
+      <w:proofErr w:type="spellEnd"/>
+      <w:r>
+        <w:rPr>
+          <w:rFonts w:ascii="Times New Roman" w:hAnsi="Times New Roman" w:cs="Times New Roman"/>
+          <w:sz w:val="22"/>
+          <w:szCs w:val="22"/>
+        </w:rPr>
+        <w:t xml:space="preserve"> Raj, Min Xu</w:t>
       </w:r>
       <w:r>
         <w:rPr>
@@ -2827,7 +3075,61 @@
           <w:sz w:val="22"/>
           <w:szCs w:val="22"/>
         </w:rPr>
-        <w:t>, Xiaoyuan Wang, Qingran Lin, Albert Xiao, Haoyu Chen, Shizheng Wen, Hao Zhang, Lu Qi, Ming-Hsuan Yang, Min Xu, Laszlo A. Jeni, Yizhou Zhao, “Multi-Object System Identification from Videos”,</w:t>
+        <w:t xml:space="preserve">, </w:t>
+      </w:r>
+      <w:proofErr w:type="spellStart"/>
+      <w:r>
+        <w:rPr>
+          <w:rFonts w:ascii="Times New Roman" w:hAnsi="Times New Roman" w:cs="Times New Roman"/>
+          <w:sz w:val="22"/>
+          <w:szCs w:val="22"/>
+        </w:rPr>
+        <w:t>Xiaoyuan</w:t>
+      </w:r>
+      <w:proofErr w:type="spellEnd"/>
+      <w:r>
+        <w:rPr>
+          <w:rFonts w:ascii="Times New Roman" w:hAnsi="Times New Roman" w:cs="Times New Roman"/>
+          <w:sz w:val="22"/>
+          <w:szCs w:val="22"/>
+        </w:rPr>
+        <w:t xml:space="preserve"> Wang, </w:t>
+      </w:r>
+      <w:proofErr w:type="spellStart"/>
+      <w:r>
+        <w:rPr>
+          <w:rFonts w:ascii="Times New Roman" w:hAnsi="Times New Roman" w:cs="Times New Roman"/>
+          <w:sz w:val="22"/>
+          <w:szCs w:val="22"/>
+        </w:rPr>
+        <w:t>Qingran</w:t>
+      </w:r>
+      <w:proofErr w:type="spellEnd"/>
+      <w:r>
+        <w:rPr>
+          <w:rFonts w:ascii="Times New Roman" w:hAnsi="Times New Roman" w:cs="Times New Roman"/>
+          <w:sz w:val="22"/>
+          <w:szCs w:val="22"/>
+        </w:rPr>
+        <w:t xml:space="preserve"> Lin, Albert Xiao, Haoyu Chen, </w:t>
+      </w:r>
+      <w:proofErr w:type="spellStart"/>
+      <w:r>
+        <w:rPr>
+          <w:rFonts w:ascii="Times New Roman" w:hAnsi="Times New Roman" w:cs="Times New Roman"/>
+          <w:sz w:val="22"/>
+          <w:szCs w:val="22"/>
+        </w:rPr>
+        <w:t>Shizheng</w:t>
+      </w:r>
+      <w:proofErr w:type="spellEnd"/>
+      <w:r>
+        <w:rPr>
+          <w:rFonts w:ascii="Times New Roman" w:hAnsi="Times New Roman" w:cs="Times New Roman"/>
+          <w:sz w:val="22"/>
+          <w:szCs w:val="22"/>
+        </w:rPr>
+        <w:t xml:space="preserve"> Wen, Hao Zhang, Lu Qi, Ming-Hsuan Yang, Min Xu, Laszlo A. Jeni, Yizhou Zhao, “Multi-Object System Identification from Videos”,</w:t>
       </w:r>
       <w:r>
         <w:rPr>

</xml_diff>

<commit_message>
Mobile: numbered bullets, pub layout fix, education page script
- Convert dash bullets to numbered lists on mobile for experience and projects
- Keep side-by-side pub card layout on mobile (100px thumb)
- Add script.js to education page
- Update resume with revised Bake AI descriptions

Co-Authored-By: Claude Opus 4.6 <noreply@anthropic.com>
</commit_message>
<xml_diff>
--- a/assets/Chunjiang Liu Resume.docx
+++ b/assets/Chunjiang Liu Resume.docx
@@ -945,10 +945,9 @@
       <w:pPr>
         <w:pStyle w:val="ListParagraph"/>
         <w:numPr>
-          <w:ilvl w:val="0"/>
+          <w:ilvl w:val="1"/>
           <w:numId w:val="5"/>
         </w:numPr>
-        <w:ind w:left="714" w:hanging="357"/>
         <w:jc w:val="both"/>
         <w:rPr>
           <w:rFonts w:ascii="Times New Roman" w:hAnsi="Times New Roman" w:cs="Times New Roman"/>
@@ -961,7 +960,43 @@
           <w:rFonts w:ascii="Times New Roman" w:hAnsi="Times New Roman"/>
           <w:sz w:val="22"/>
         </w:rPr>
-        <w:t>Designed and built interactive leaderboard UI and benchmark platform with Next.js.</w:t>
+        <w:t>Designed and built interactive leaderboard UI with Next.js.</w:t>
+      </w:r>
+    </w:p>
+    <w:p>
+      <w:pPr>
+        <w:pStyle w:val="ListParagraph"/>
+        <w:numPr>
+          <w:ilvl w:val="1"/>
+          <w:numId w:val="5"/>
+        </w:numPr>
+        <w:jc w:val="both"/>
+        <w:rPr>
+          <w:rFonts w:ascii="Times New Roman" w:hAnsi="Times New Roman" w:cs="Times New Roman" w:hint="eastAsia"/>
+          <w:sz w:val="22"/>
+          <w:szCs w:val="22"/>
+        </w:rPr>
+      </w:pPr>
+      <w:r>
+        <w:rPr>
+          <w:rFonts w:ascii="Times New Roman" w:hAnsi="Times New Roman" w:hint="eastAsia"/>
+          <w:sz w:val="22"/>
+        </w:rPr>
+        <w:t xml:space="preserve">Built the evaluation environment for the </w:t>
+      </w:r>
+      <w:r>
+        <w:rPr>
+          <w:rFonts w:ascii="Times New Roman" w:hAnsi="Times New Roman"/>
+          <w:sz w:val="22"/>
+        </w:rPr>
+        <w:t>benchmark</w:t>
+      </w:r>
+      <w:r>
+        <w:rPr>
+          <w:rFonts w:ascii="Times New Roman" w:hAnsi="Times New Roman" w:hint="eastAsia"/>
+          <w:sz w:val="22"/>
+        </w:rPr>
+        <w:t>.</w:t>
       </w:r>
     </w:p>
     <w:p>
@@ -979,12 +1014,190 @@
           <w:szCs w:val="22"/>
         </w:rPr>
       </w:pPr>
+      <w:proofErr w:type="spellStart"/>
       <w:r>
         <w:rPr>
           <w:rFonts w:ascii="Times New Roman" w:hAnsi="Times New Roman"/>
           <w:sz w:val="22"/>
         </w:rPr>
-        <w:t>ArtArena: A visual aesthetic benchmark for AI model evaluation.</w:t>
+        <w:t>ArtArena</w:t>
+      </w:r>
+      <w:proofErr w:type="spellEnd"/>
+      <w:r>
+        <w:rPr>
+          <w:rFonts w:ascii="Times New Roman" w:hAnsi="Times New Roman"/>
+          <w:sz w:val="22"/>
+        </w:rPr>
+        <w:t>: A visual aesthetic benchmark for AI model evaluation.</w:t>
+      </w:r>
+    </w:p>
+    <w:p>
+      <w:pPr>
+        <w:pStyle w:val="ListParagraph"/>
+        <w:numPr>
+          <w:ilvl w:val="1"/>
+          <w:numId w:val="5"/>
+        </w:numPr>
+        <w:jc w:val="both"/>
+        <w:rPr>
+          <w:rFonts w:ascii="Times New Roman" w:hAnsi="Times New Roman" w:cs="Times New Roman"/>
+          <w:sz w:val="22"/>
+          <w:szCs w:val="22"/>
+        </w:rPr>
+      </w:pPr>
+      <w:r>
+        <w:rPr>
+          <w:rFonts w:ascii="Times New Roman" w:hAnsi="Times New Roman"/>
+          <w:sz w:val="22"/>
+        </w:rPr>
+        <w:t>Built 3D rendering and text-to-image data pipelines for artist-curated evaluation sets.</w:t>
+      </w:r>
+      <w:hyperlink r:id="rId8">
+        <w:r>
+          <w:rPr>
+            <w:rFonts w:ascii="Times New Roman" w:hAnsi="Times New Roman"/>
+            <w:color w:val="0563C1"/>
+            <w:sz w:val="22"/>
+            <w:u w:val="single"/>
+          </w:rPr>
+          <w:t xml:space="preserve"> [link]</w:t>
+        </w:r>
+      </w:hyperlink>
+    </w:p>
+    <w:p>
+      <w:pPr>
+        <w:rPr>
+          <w:rFonts w:ascii="Times New Roman" w:hAnsi="Times New Roman" w:cs="Times New Roman"/>
+          <w:sz w:val="22"/>
+          <w:szCs w:val="22"/>
+        </w:rPr>
+      </w:pPr>
+    </w:p>
+    <w:p>
+      <w:pPr>
+        <w:rPr>
+          <w:rFonts w:ascii="Times New Roman" w:hAnsi="Times New Roman" w:cs="Times New Roman"/>
+          <w:sz w:val="22"/>
+          <w:szCs w:val="22"/>
+        </w:rPr>
+      </w:pPr>
+      <w:r>
+        <w:rPr>
+          <w:rFonts w:ascii="Times New Roman" w:hAnsi="Times New Roman"/>
+          <w:sz w:val="22"/>
+        </w:rPr>
+        <w:t>CARNEGIE MELLON UNIVERSITY</w:t>
+      </w:r>
+      <w:r>
+        <w:rPr>
+          <w:rFonts w:ascii="Times New Roman" w:hAnsi="Times New Roman"/>
+          <w:sz w:val="22"/>
+        </w:rPr>
+        <w:tab/>
+      </w:r>
+      <w:r>
+        <w:rPr>
+          <w:rFonts w:ascii="Times New Roman" w:hAnsi="Times New Roman"/>
+          <w:sz w:val="22"/>
+        </w:rPr>
+        <w:tab/>
+      </w:r>
+      <w:r>
+        <w:rPr>
+          <w:rFonts w:ascii="Times New Roman" w:hAnsi="Times New Roman"/>
+          <w:sz w:val="22"/>
+        </w:rPr>
+        <w:tab/>
+      </w:r>
+      <w:r>
+        <w:rPr>
+          <w:rFonts w:ascii="Times New Roman" w:hAnsi="Times New Roman"/>
+          <w:sz w:val="22"/>
+        </w:rPr>
+        <w:tab/>
+      </w:r>
+      <w:r>
+        <w:rPr>
+          <w:rFonts w:ascii="Times New Roman" w:hAnsi="Times New Roman"/>
+          <w:sz w:val="22"/>
+        </w:rPr>
+        <w:tab/>
+      </w:r>
+      <w:r>
+        <w:rPr>
+          <w:rFonts w:ascii="Times New Roman" w:hAnsi="Times New Roman"/>
+          <w:sz w:val="22"/>
+        </w:rPr>
+        <w:tab/>
+      </w:r>
+      <w:proofErr w:type="gramStart"/>
+      <w:r>
+        <w:rPr>
+          <w:rFonts w:ascii="Times New Roman" w:hAnsi="Times New Roman"/>
+          <w:sz w:val="22"/>
+        </w:rPr>
+        <w:tab/>
+      </w:r>
+      <w:r>
+        <w:rPr>
+          <w:rFonts w:ascii="Times New Roman" w:hAnsi="Times New Roman" w:hint="eastAsia"/>
+          <w:sz w:val="22"/>
+        </w:rPr>
+        <w:t xml:space="preserve">  </w:t>
+      </w:r>
+      <w:r>
+        <w:rPr>
+          <w:rFonts w:ascii="Times New Roman" w:hAnsi="Times New Roman"/>
+          <w:sz w:val="22"/>
+        </w:rPr>
+        <w:t>Pittsburgh</w:t>
+      </w:r>
+      <w:proofErr w:type="gramEnd"/>
+      <w:r>
+        <w:rPr>
+          <w:rFonts w:ascii="Times New Roman" w:hAnsi="Times New Roman"/>
+          <w:sz w:val="22"/>
+        </w:rPr>
+        <w:t>, PA</w:t>
+      </w:r>
+    </w:p>
+    <w:p>
+      <w:pPr>
+        <w:jc w:val="distribute"/>
+        <w:rPr>
+          <w:rFonts w:ascii="Times New Roman" w:hAnsi="Times New Roman" w:cs="Times New Roman"/>
+          <w:sz w:val="22"/>
+          <w:szCs w:val="22"/>
+        </w:rPr>
+      </w:pPr>
+      <w:r>
+        <w:rPr>
+          <w:rFonts w:ascii="Times New Roman" w:hAnsi="Times New Roman"/>
+          <w:i/>
+          <w:sz w:val="22"/>
+        </w:rPr>
+        <w:t>Research Associate</w:t>
+      </w:r>
+      <w:r>
+        <w:rPr>
+          <w:rFonts w:ascii="Times New Roman" w:hAnsi="Times New Roman"/>
+          <w:sz w:val="22"/>
+        </w:rPr>
+        <w:tab/>
+      </w:r>
+      <w:r>
+        <w:rPr>
+          <w:rFonts w:ascii="Times New Roman" w:hAnsi="Times New Roman" w:hint="eastAsia"/>
+          <w:sz w:val="22"/>
+        </w:rPr>
+        <w:t xml:space="preserve">                                                                                                  </w:t>
+      </w:r>
+      <w:r>
+        <w:rPr>
+          <w:rFonts w:ascii="Times New Roman" w:hAnsi="Times New Roman"/>
+          <w:sz w:val="22"/>
+        </w:rPr>
+        <w:t>Jan 2024 - Dec 2025</w:t>
       </w:r>
     </w:p>
     <w:p>
@@ -1007,154 +1220,7 @@
           <w:rFonts w:ascii="Times New Roman" w:hAnsi="Times New Roman"/>
           <w:sz w:val="22"/>
         </w:rPr>
-        <w:t>Built 3D rendering and text-to-image data pipelines for artist-curated evaluation sets.</w:t>
-      </w:r>
-      <w:hyperlink r:id="rId10">
-        <w:r>
-          <w:rPr>
-            <w:rFonts w:ascii="Times New Roman" w:hAnsi="Times New Roman"/>
-            <w:color w:val="0563C1"/>
-            <w:u w:val="single"/>
-            <w:sz w:val="22"/>
-          </w:rPr>
-          <w:t xml:space="preserve"> [link]</w:t>
-        </w:r>
-      </w:hyperlink>
-    </w:p>
-    <w:p>
-      <w:pPr>
-        <w:rPr>
-          <w:rFonts w:ascii="Times New Roman" w:hAnsi="Times New Roman" w:cs="Times New Roman"/>
-          <w:sz w:val="22"/>
-          <w:szCs w:val="22"/>
-        </w:rPr>
-      </w:pPr>
-    </w:p>
-    <w:p>
-      <w:pPr>
-        <w:rPr>
-          <w:rFonts w:ascii="Times New Roman" w:hAnsi="Times New Roman" w:cs="Times New Roman"/>
-          <w:sz w:val="22"/>
-          <w:szCs w:val="22"/>
-        </w:rPr>
-      </w:pPr>
-      <w:r>
-        <w:rPr>
-          <w:rFonts w:ascii="Times New Roman" w:hAnsi="Times New Roman"/>
-          <w:sz w:val="22"/>
-        </w:rPr>
-        <w:t>CARNEGIE MELLON UNIVERSITY</w:t>
-      </w:r>
-      <w:r>
-        <w:rPr>
-          <w:rFonts w:ascii="Times New Roman" w:hAnsi="Times New Roman"/>
-          <w:sz w:val="22"/>
-        </w:rPr>
-        <w:tab/>
-      </w:r>
-      <w:r>
-        <w:rPr>
-          <w:rFonts w:ascii="Times New Roman" w:hAnsi="Times New Roman"/>
-          <w:sz w:val="22"/>
-        </w:rPr>
-        <w:tab/>
-      </w:r>
-      <w:r>
-        <w:rPr>
-          <w:rFonts w:ascii="Times New Roman" w:hAnsi="Times New Roman"/>
-          <w:sz w:val="22"/>
-        </w:rPr>
-        <w:tab/>
-      </w:r>
-      <w:r>
-        <w:rPr>
-          <w:rFonts w:ascii="Times New Roman" w:hAnsi="Times New Roman"/>
-          <w:sz w:val="22"/>
-        </w:rPr>
-        <w:tab/>
-      </w:r>
-      <w:r>
-        <w:rPr>
-          <w:rFonts w:ascii="Times New Roman" w:hAnsi="Times New Roman"/>
-          <w:sz w:val="22"/>
-        </w:rPr>
-        <w:tab/>
-      </w:r>
-      <w:r>
-        <w:rPr>
-          <w:rFonts w:ascii="Times New Roman" w:hAnsi="Times New Roman"/>
-          <w:sz w:val="22"/>
-        </w:rPr>
-        <w:tab/>
-      </w:r>
-      <w:proofErr w:type="gramStart"/>
-      <w:r>
-        <w:rPr>
-          <w:rFonts w:ascii="Times New Roman" w:hAnsi="Times New Roman"/>
-          <w:sz w:val="22"/>
-        </w:rPr>
-        <w:tab/>
-      </w:r>
-      <w:r>
-        <w:rPr>
-          <w:rFonts w:ascii="Times New Roman" w:hAnsi="Times New Roman" w:hint="eastAsia"/>
-          <w:sz w:val="22"/>
-        </w:rPr>
-        <w:t xml:space="preserve">  </w:t>
-      </w:r>
-      <w:r>
-        <w:rPr>
-          <w:rFonts w:ascii="Times New Roman" w:hAnsi="Times New Roman"/>
-          <w:sz w:val="22"/>
-        </w:rPr>
-        <w:t>Pittsburgh</w:t>
-      </w:r>
-      <w:proofErr w:type="gramEnd"/>
-      <w:r>
-        <w:rPr>
-          <w:rFonts w:ascii="Times New Roman" w:hAnsi="Times New Roman"/>
-          <w:sz w:val="22"/>
-        </w:rPr>
-        <w:t>, PA</w:t>
-      </w:r>
-    </w:p>
-    <w:p>
-      <w:pPr>
-        <w:jc w:val="distribute"/>
-        <w:rPr>
-          <w:rFonts w:ascii="Times New Roman" w:hAnsi="Times New Roman" w:cs="Times New Roman"/>
-          <w:sz w:val="22"/>
-          <w:szCs w:val="22"/>
-        </w:rPr>
-      </w:pPr>
-      <w:r>
-        <w:rPr>
-          <w:rFonts w:ascii="Times New Roman" w:hAnsi="Times New Roman"/>
-          <w:i/>
-          <w:sz w:val="22"/>
-        </w:rPr>
-        <w:t>Research Associate</w:t>
-      </w:r>
-      <w:r>
-        <w:rPr>
-          <w:rFonts w:ascii="Times New Roman" w:hAnsi="Times New Roman"/>
-          <w:sz w:val="22"/>
-        </w:rPr>
-        <w:tab/>
-      </w:r>
-      <w:r>
-        <w:rPr>
-          <w:rFonts w:ascii="Times New Roman" w:hAnsi="Times New Roman" w:hint="eastAsia"/>
-          <w:sz w:val="22"/>
-        </w:rPr>
-        <w:t xml:space="preserve">                                                                                                  </w:t>
-      </w:r>
-      <w:r>
-        <w:rPr>
-          <w:rFonts w:ascii="Times New Roman" w:hAnsi="Times New Roman"/>
-          <w:sz w:val="22"/>
-        </w:rPr>
-        <w:t>Jan 2024 - Dec 2025</w:t>
+        <w:t>Multi-object dynamic reconstruction and physics estimation via differentiable simulation.</w:t>
       </w:r>
     </w:p>
     <w:p>
@@ -1177,7 +1243,7 @@
           <w:rFonts w:ascii="Times New Roman" w:hAnsi="Times New Roman"/>
           <w:sz w:val="22"/>
         </w:rPr>
-        <w:t>Multi-object dynamic reconstruction and physics estimation via differentiable simulation.</w:t>
+        <w:t>Material-agnostic dynamic reconstruction with neural constitutive models.</w:t>
       </w:r>
     </w:p>
     <w:p>
@@ -1200,7 +1266,92 @@
           <w:rFonts w:ascii="Times New Roman" w:hAnsi="Times New Roman"/>
           <w:sz w:val="22"/>
         </w:rPr>
-        <w:t>Material-agnostic dynamic reconstruction with neural constitutive models.</w:t>
+        <w:t>Head avatar editing with joint appearance, motion, and lighting control.</w:t>
+      </w:r>
+    </w:p>
+    <w:p>
+      <w:pPr>
+        <w:rPr>
+          <w:rFonts w:ascii="Times New Roman" w:hAnsi="Times New Roman" w:cs="Times New Roman"/>
+          <w:sz w:val="22"/>
+          <w:szCs w:val="22"/>
+        </w:rPr>
+      </w:pPr>
+    </w:p>
+    <w:p>
+      <w:pPr>
+        <w:rPr>
+          <w:rFonts w:ascii="Times New Roman" w:hAnsi="Times New Roman" w:cs="Times New Roman"/>
+          <w:sz w:val="22"/>
+          <w:szCs w:val="22"/>
+        </w:rPr>
+      </w:pPr>
+      <w:r>
+        <w:rPr>
+          <w:rFonts w:ascii="Times New Roman" w:hAnsi="Times New Roman"/>
+          <w:sz w:val="22"/>
+        </w:rPr>
+        <w:t>YINZCAM INC.</w:t>
+      </w:r>
+      <w:r>
+        <w:rPr>
+          <w:rFonts w:ascii="Times New Roman" w:hAnsi="Times New Roman"/>
+          <w:sz w:val="22"/>
+        </w:rPr>
+        <w:tab/>
+      </w:r>
+      <w:r>
+        <w:rPr>
+          <w:rFonts w:ascii="Times New Roman" w:hAnsi="Times New Roman" w:hint="eastAsia"/>
+          <w:sz w:val="22"/>
+        </w:rPr>
+        <w:t xml:space="preserve">                                                                                                           </w:t>
+      </w:r>
+      <w:r>
+        <w:rPr>
+          <w:rFonts w:ascii="Times New Roman" w:hAnsi="Times New Roman"/>
+          <w:sz w:val="22"/>
+        </w:rPr>
+        <w:t>Pittsburgh, PA</w:t>
+      </w:r>
+    </w:p>
+    <w:p>
+      <w:pPr>
+        <w:jc w:val="distribute"/>
+        <w:rPr>
+          <w:rFonts w:ascii="Times New Roman" w:hAnsi="Times New Roman" w:cs="Times New Roman"/>
+          <w:sz w:val="22"/>
+          <w:szCs w:val="22"/>
+        </w:rPr>
+      </w:pPr>
+      <w:r>
+        <w:rPr>
+          <w:rFonts w:ascii="Times New Roman" w:hAnsi="Times New Roman"/>
+          <w:i/>
+          <w:sz w:val="22"/>
+        </w:rPr>
+        <w:t>Research Intern</w:t>
+      </w:r>
+      <w:r>
+        <w:rPr>
+          <w:rFonts w:ascii="Times New Roman" w:hAnsi="Times New Roman"/>
+          <w:sz w:val="22"/>
+        </w:rPr>
+        <w:tab/>
+      </w:r>
+      <w:r>
+        <w:rPr>
+          <w:rFonts w:ascii="Times New Roman" w:hAnsi="Times New Roman" w:hint="eastAsia"/>
+          <w:sz w:val="22"/>
+        </w:rPr>
+        <w:t xml:space="preserve">                                                                                                             </w:t>
+      </w:r>
+      <w:r>
+        <w:rPr>
+          <w:rFonts w:ascii="Times New Roman" w:hAnsi="Times New Roman"/>
+          <w:sz w:val="22"/>
+        </w:rPr>
+        <w:t>May 2023 - Aug 2023</w:t>
       </w:r>
     </w:p>
     <w:p>
@@ -1223,92 +1374,7 @@
           <w:rFonts w:ascii="Times New Roman" w:hAnsi="Times New Roman"/>
           <w:sz w:val="22"/>
         </w:rPr>
-        <w:t>Head avatar editing with joint appearance, motion, and lighting control.</w:t>
-      </w:r>
-    </w:p>
-    <w:p>
-      <w:pPr>
-        <w:rPr>
-          <w:rFonts w:ascii="Times New Roman" w:hAnsi="Times New Roman" w:cs="Times New Roman"/>
-          <w:sz w:val="22"/>
-          <w:szCs w:val="22"/>
-        </w:rPr>
-      </w:pPr>
-    </w:p>
-    <w:p>
-      <w:pPr>
-        <w:rPr>
-          <w:rFonts w:ascii="Times New Roman" w:hAnsi="Times New Roman" w:cs="Times New Roman"/>
-          <w:sz w:val="22"/>
-          <w:szCs w:val="22"/>
-        </w:rPr>
-      </w:pPr>
-      <w:r>
-        <w:rPr>
-          <w:rFonts w:ascii="Times New Roman" w:hAnsi="Times New Roman"/>
-          <w:sz w:val="22"/>
-        </w:rPr>
-        <w:t>YINZCAM INC.</w:t>
-      </w:r>
-      <w:r>
-        <w:rPr>
-          <w:rFonts w:ascii="Times New Roman" w:hAnsi="Times New Roman"/>
-          <w:sz w:val="22"/>
-        </w:rPr>
-        <w:tab/>
-      </w:r>
-      <w:r>
-        <w:rPr>
-          <w:rFonts w:ascii="Times New Roman" w:hAnsi="Times New Roman" w:hint="eastAsia"/>
-          <w:sz w:val="22"/>
-        </w:rPr>
-        <w:t xml:space="preserve">                                                                                                           </w:t>
-      </w:r>
-      <w:r>
-        <w:rPr>
-          <w:rFonts w:ascii="Times New Roman" w:hAnsi="Times New Roman"/>
-          <w:sz w:val="22"/>
-        </w:rPr>
-        <w:t>Pittsburgh, PA</w:t>
-      </w:r>
-    </w:p>
-    <w:p>
-      <w:pPr>
-        <w:jc w:val="distribute"/>
-        <w:rPr>
-          <w:rFonts w:ascii="Times New Roman" w:hAnsi="Times New Roman" w:cs="Times New Roman"/>
-          <w:sz w:val="22"/>
-          <w:szCs w:val="22"/>
-        </w:rPr>
-      </w:pPr>
-      <w:r>
-        <w:rPr>
-          <w:rFonts w:ascii="Times New Roman" w:hAnsi="Times New Roman"/>
-          <w:i/>
-          <w:sz w:val="22"/>
-        </w:rPr>
-        <w:t>Research Intern</w:t>
-      </w:r>
-      <w:r>
-        <w:rPr>
-          <w:rFonts w:ascii="Times New Roman" w:hAnsi="Times New Roman"/>
-          <w:sz w:val="22"/>
-        </w:rPr>
-        <w:tab/>
-      </w:r>
-      <w:r>
-        <w:rPr>
-          <w:rFonts w:ascii="Times New Roman" w:hAnsi="Times New Roman" w:hint="eastAsia"/>
-          <w:sz w:val="22"/>
-        </w:rPr>
-        <w:t xml:space="preserve">                                                                                                             </w:t>
-      </w:r>
-      <w:r>
-        <w:rPr>
-          <w:rFonts w:ascii="Times New Roman" w:hAnsi="Times New Roman"/>
-          <w:sz w:val="22"/>
-        </w:rPr>
-        <w:t>May 2023 - Aug 2023</w:t>
+        <w:t>Built real-time data collection and analysis system for esports players</w:t>
       </w:r>
     </w:p>
     <w:p>
@@ -1328,10 +1394,23 @@
       </w:pPr>
       <w:r>
         <w:rPr>
-          <w:rFonts w:ascii="Times New Roman" w:hAnsi="Times New Roman"/>
-          <w:sz w:val="22"/>
-        </w:rPr>
-        <w:t>Built real-time data collection and analysis system for esports players</w:t>
+          <w:rFonts w:ascii="Times New Roman" w:hAnsi="Times New Roman" w:cs="Times New Roman"/>
+          <w:color w:val="000000"/>
+          <w:sz w:val="22"/>
+          <w:szCs w:val="22"/>
+          <w:shd w:val="clear" w:color="auto" w:fill="FAFAFA"/>
+        </w:rPr>
+        <w:t>Synchronized in-game telemetry: health, armor</w:t>
+      </w:r>
+      <w:r>
+        <w:rPr>
+          <w:rFonts w:ascii="Times New Roman" w:hAnsi="Times New Roman" w:cs="Times New Roman" w:hint="eastAsia"/>
+          <w:color w:val="000000"/>
+          <w:sz w:val="22"/>
+          <w:szCs w:val="22"/>
+          <w:shd w:val="clear" w:color="auto" w:fill="FAFAFA"/>
+        </w:rPr>
+        <w:t xml:space="preserve"> and KDA.</w:t>
       </w:r>
     </w:p>
     <w:p>
@@ -1357,7 +1436,7 @@
           <w:szCs w:val="22"/>
           <w:shd w:val="clear" w:color="auto" w:fill="FAFAFA"/>
         </w:rPr>
-        <w:t>Synchronized in-game telemetry: health, armor</w:t>
+        <w:t>Synchronized biometric streams Captured: ye tracking, heart rate, wrist gestures, and body posture</w:t>
       </w:r>
       <w:r>
         <w:rPr>
@@ -1367,7 +1446,272 @@
           <w:szCs w:val="22"/>
           <w:shd w:val="clear" w:color="auto" w:fill="FAFAFA"/>
         </w:rPr>
-        <w:t xml:space="preserve"> and KDA.</w:t>
+        <w:t>.</w:t>
+      </w:r>
+    </w:p>
+    <w:p>
+      <w:pPr>
+        <w:rPr>
+          <w:rFonts w:ascii="Times New Roman" w:hAnsi="Times New Roman" w:cs="Times New Roman"/>
+          <w:sz w:val="22"/>
+          <w:szCs w:val="22"/>
+        </w:rPr>
+      </w:pPr>
+    </w:p>
+    <w:p>
+      <w:pPr>
+        <w:rPr>
+          <w:rFonts w:ascii="Times New Roman" w:hAnsi="Times New Roman" w:cs="Times New Roman"/>
+          <w:sz w:val="22"/>
+          <w:szCs w:val="22"/>
+        </w:rPr>
+      </w:pPr>
+      <w:r>
+        <w:rPr>
+          <w:rFonts w:ascii="Times New Roman" w:hAnsi="Times New Roman" w:cs="Times New Roman"/>
+          <w:sz w:val="22"/>
+          <w:szCs w:val="22"/>
+        </w:rPr>
+        <w:t>YAMAHA MOTOR SOLUTIONS CO., LTD. XIAMEN</w:t>
+      </w:r>
+      <w:r>
+        <w:rPr>
+          <w:rFonts w:ascii="Times New Roman" w:hAnsi="Times New Roman" w:cs="Times New Roman"/>
+          <w:sz w:val="22"/>
+          <w:szCs w:val="22"/>
+        </w:rPr>
+        <w:tab/>
+      </w:r>
+      <w:r>
+        <w:rPr>
+          <w:rFonts w:ascii="Times New Roman" w:hAnsi="Times New Roman" w:cs="Times New Roman"/>
+          <w:sz w:val="22"/>
+          <w:szCs w:val="22"/>
+        </w:rPr>
+        <w:tab/>
+      </w:r>
+      <w:r>
+        <w:rPr>
+          <w:rFonts w:ascii="Times New Roman" w:hAnsi="Times New Roman" w:cs="Times New Roman"/>
+          <w:sz w:val="22"/>
+          <w:szCs w:val="22"/>
+        </w:rPr>
+        <w:tab/>
+        <w:t xml:space="preserve">            </w:t>
+      </w:r>
+      <w:r>
+        <w:rPr>
+          <w:rFonts w:ascii="Times New Roman" w:hAnsi="Times New Roman" w:cs="Times New Roman"/>
+          <w:sz w:val="22"/>
+          <w:szCs w:val="22"/>
+        </w:rPr>
+        <w:t xml:space="preserve">   </w:t>
+      </w:r>
+      <w:proofErr w:type="spellStart"/>
+      <w:r>
+        <w:rPr>
+          <w:rFonts w:ascii="Times New Roman" w:hAnsi="Times New Roman" w:cs="Times New Roman"/>
+          <w:sz w:val="22"/>
+          <w:szCs w:val="22"/>
+        </w:rPr>
+        <w:t>Xiamen</w:t>
+      </w:r>
+      <w:proofErr w:type="spellEnd"/>
+      <w:r>
+        <w:rPr>
+          <w:rFonts w:ascii="Times New Roman" w:hAnsi="Times New Roman" w:cs="Times New Roman"/>
+          <w:sz w:val="22"/>
+          <w:szCs w:val="22"/>
+        </w:rPr>
+        <w:t>,</w:t>
+      </w:r>
+      <w:r>
+        <w:rPr>
+          <w:rFonts w:ascii="Times New Roman" w:hAnsi="Times New Roman" w:cs="Times New Roman" w:hint="eastAsia"/>
+          <w:sz w:val="22"/>
+          <w:szCs w:val="22"/>
+        </w:rPr>
+        <w:t xml:space="preserve"> </w:t>
+      </w:r>
+      <w:r>
+        <w:rPr>
+          <w:rFonts w:ascii="Times New Roman" w:hAnsi="Times New Roman" w:cs="Times New Roman"/>
+          <w:sz w:val="22"/>
+          <w:szCs w:val="22"/>
+        </w:rPr>
+        <w:t>China</w:t>
+      </w:r>
+    </w:p>
+    <w:p>
+      <w:pPr>
+        <w:jc w:val="distribute"/>
+        <w:rPr>
+          <w:rFonts w:ascii="Times New Roman" w:hAnsi="Times New Roman" w:cs="Times New Roman"/>
+          <w:sz w:val="22"/>
+          <w:szCs w:val="22"/>
+        </w:rPr>
+      </w:pPr>
+      <w:r>
+        <w:rPr>
+          <w:rFonts w:ascii="Times New Roman" w:hAnsi="Times New Roman" w:cs="Times New Roman"/>
+          <w:i/>
+          <w:iCs/>
+          <w:sz w:val="22"/>
+          <w:szCs w:val="22"/>
+        </w:rPr>
+        <w:t xml:space="preserve">Innovation Center Intern                       </w:t>
+      </w:r>
+      <w:r>
+        <w:rPr>
+          <w:rFonts w:ascii="Times New Roman" w:hAnsi="Times New Roman" w:cs="Times New Roman"/>
+          <w:i/>
+          <w:iCs/>
+          <w:sz w:val="22"/>
+          <w:szCs w:val="22"/>
+        </w:rPr>
+        <w:tab/>
+      </w:r>
+      <w:r>
+        <w:rPr>
+          <w:rFonts w:ascii="Times New Roman" w:hAnsi="Times New Roman" w:cs="Times New Roman"/>
+          <w:sz w:val="22"/>
+          <w:szCs w:val="22"/>
+        </w:rPr>
+        <w:tab/>
+      </w:r>
+      <w:r>
+        <w:rPr>
+          <w:rFonts w:ascii="Times New Roman" w:hAnsi="Times New Roman" w:cs="Times New Roman"/>
+          <w:sz w:val="22"/>
+          <w:szCs w:val="22"/>
+        </w:rPr>
+        <w:tab/>
+      </w:r>
+      <w:r>
+        <w:rPr>
+          <w:rFonts w:ascii="Times New Roman" w:hAnsi="Times New Roman" w:cs="Times New Roman"/>
+          <w:sz w:val="22"/>
+          <w:szCs w:val="22"/>
+        </w:rPr>
+        <w:tab/>
+      </w:r>
+      <w:r>
+        <w:rPr>
+          <w:rFonts w:ascii="Times New Roman" w:hAnsi="Times New Roman" w:cs="Times New Roman"/>
+          <w:sz w:val="22"/>
+          <w:szCs w:val="22"/>
+        </w:rPr>
+        <w:tab/>
+      </w:r>
+      <w:r>
+        <w:rPr>
+          <w:rFonts w:ascii="Times New Roman" w:hAnsi="Times New Roman" w:cs="Times New Roman"/>
+          <w:i/>
+          <w:iCs/>
+          <w:sz w:val="22"/>
+          <w:szCs w:val="22"/>
+        </w:rPr>
+        <w:t xml:space="preserve">    </w:t>
+      </w:r>
+      <w:r>
+        <w:rPr>
+          <w:rFonts w:ascii="Times New Roman" w:hAnsi="Times New Roman" w:cs="Times New Roman"/>
+          <w:i/>
+          <w:iCs/>
+          <w:sz w:val="22"/>
+          <w:szCs w:val="22"/>
+        </w:rPr>
+        <w:t xml:space="preserve">     </w:t>
+      </w:r>
+      <w:r>
+        <w:rPr>
+          <w:rFonts w:ascii="Times New Roman" w:hAnsi="Times New Roman" w:cs="Times New Roman"/>
+          <w:sz w:val="22"/>
+          <w:szCs w:val="22"/>
+        </w:rPr>
+        <w:t xml:space="preserve"> </w:t>
+      </w:r>
+      <w:r>
+        <w:rPr>
+          <w:rFonts w:ascii="Times New Roman" w:hAnsi="Times New Roman" w:cs="Times New Roman"/>
+          <w:sz w:val="22"/>
+          <w:szCs w:val="22"/>
+        </w:rPr>
+        <w:t xml:space="preserve"> </w:t>
+      </w:r>
+      <w:r>
+        <w:rPr>
+          <w:rFonts w:ascii="Times New Roman" w:hAnsi="Times New Roman" w:cs="Times New Roman"/>
+          <w:sz w:val="22"/>
+          <w:szCs w:val="22"/>
+        </w:rPr>
+        <w:t xml:space="preserve"> </w:t>
+      </w:r>
+      <w:r>
+        <w:rPr>
+          <w:rFonts w:ascii="Times New Roman" w:hAnsi="Times New Roman" w:cs="Times New Roman"/>
+          <w:sz w:val="22"/>
+          <w:szCs w:val="22"/>
+        </w:rPr>
+        <w:t>July</w:t>
+      </w:r>
+      <w:r>
+        <w:rPr>
+          <w:rFonts w:ascii="Times New Roman" w:hAnsi="Times New Roman" w:cs="Times New Roman"/>
+          <w:i/>
+          <w:iCs/>
+          <w:sz w:val="22"/>
+          <w:szCs w:val="22"/>
+        </w:rPr>
+        <w:t xml:space="preserve"> </w:t>
+      </w:r>
+      <w:r>
+        <w:rPr>
+          <w:rFonts w:ascii="Times New Roman" w:hAnsi="Times New Roman" w:cs="Times New Roman"/>
+          <w:sz w:val="22"/>
+          <w:szCs w:val="22"/>
+        </w:rPr>
+        <w:t>2022</w:t>
+      </w:r>
+      <w:r>
+        <w:rPr>
+          <w:rFonts w:ascii="Times New Roman" w:hAnsi="Times New Roman" w:cs="Times New Roman"/>
+          <w:sz w:val="22"/>
+          <w:szCs w:val="22"/>
+        </w:rPr>
+        <w:t xml:space="preserve"> </w:t>
+      </w:r>
+      <w:r>
+        <w:rPr>
+          <w:rFonts w:ascii="Times New Roman" w:hAnsi="Times New Roman" w:cs="Times New Roman"/>
+          <w:sz w:val="22"/>
+          <w:szCs w:val="22"/>
+        </w:rPr>
+        <w:t>-</w:t>
+      </w:r>
+      <w:r>
+        <w:rPr>
+          <w:rFonts w:ascii="Times New Roman" w:hAnsi="Times New Roman" w:cs="Times New Roman"/>
+          <w:sz w:val="22"/>
+          <w:szCs w:val="22"/>
+        </w:rPr>
+        <w:t xml:space="preserve"> </w:t>
+      </w:r>
+      <w:r>
+        <w:rPr>
+          <w:rFonts w:ascii="Times New Roman" w:hAnsi="Times New Roman" w:cs="Times New Roman"/>
+          <w:sz w:val="22"/>
+          <w:szCs w:val="22"/>
+        </w:rPr>
+        <w:t xml:space="preserve">October </w:t>
+      </w:r>
+      <w:r>
+        <w:rPr>
+          <w:rFonts w:ascii="Times New Roman" w:hAnsi="Times New Roman" w:cs="Times New Roman"/>
+          <w:sz w:val="22"/>
+          <w:szCs w:val="22"/>
+        </w:rPr>
+        <w:t xml:space="preserve">2022 </w:t>
       </w:r>
     </w:p>
     <w:p>
@@ -1388,287 +1732,18 @@
       <w:r>
         <w:rPr>
           <w:rFonts w:ascii="Times New Roman" w:hAnsi="Times New Roman" w:cs="Times New Roman"/>
-          <w:color w:val="000000"/>
-          <w:sz w:val="22"/>
-          <w:szCs w:val="22"/>
-          <w:shd w:val="clear" w:color="auto" w:fill="FAFAFA"/>
-        </w:rPr>
-        <w:t>Synchronized biometric streams Captured: ye tracking, heart rate, wrist gestures, and body posture</w:t>
-      </w:r>
-      <w:r>
-        <w:rPr>
-          <w:rFonts w:ascii="Times New Roman" w:hAnsi="Times New Roman" w:cs="Times New Roman" w:hint="eastAsia"/>
-          <w:color w:val="000000"/>
-          <w:sz w:val="22"/>
-          <w:szCs w:val="22"/>
-          <w:shd w:val="clear" w:color="auto" w:fill="FAFAFA"/>
-        </w:rPr>
-        <w:t>.</w:t>
-      </w:r>
-    </w:p>
-    <w:p>
-      <w:pPr>
-        <w:rPr>
-          <w:rFonts w:ascii="Times New Roman" w:hAnsi="Times New Roman" w:cs="Times New Roman"/>
-          <w:sz w:val="22"/>
-          <w:szCs w:val="22"/>
-        </w:rPr>
-      </w:pPr>
-    </w:p>
-    <w:p>
-      <w:pPr>
-        <w:rPr>
-          <w:rFonts w:ascii="Times New Roman" w:hAnsi="Times New Roman" w:cs="Times New Roman"/>
-          <w:sz w:val="22"/>
-          <w:szCs w:val="22"/>
-        </w:rPr>
-      </w:pPr>
-      <w:r>
-        <w:rPr>
-          <w:rFonts w:ascii="Times New Roman" w:hAnsi="Times New Roman" w:cs="Times New Roman"/>
-          <w:sz w:val="22"/>
-          <w:szCs w:val="22"/>
-        </w:rPr>
-        <w:t>YAMAHA MOTOR SOLUTIONS CO., LTD. XIAMEN</w:t>
-      </w:r>
-      <w:r>
-        <w:rPr>
-          <w:rFonts w:ascii="Times New Roman" w:hAnsi="Times New Roman" w:cs="Times New Roman"/>
-          <w:sz w:val="22"/>
-          <w:szCs w:val="22"/>
-        </w:rPr>
-        <w:tab/>
-      </w:r>
-      <w:r>
-        <w:rPr>
-          <w:rFonts w:ascii="Times New Roman" w:hAnsi="Times New Roman" w:cs="Times New Roman"/>
-          <w:sz w:val="22"/>
-          <w:szCs w:val="22"/>
-        </w:rPr>
-        <w:tab/>
-      </w:r>
-      <w:r>
-        <w:rPr>
-          <w:rFonts w:ascii="Times New Roman" w:hAnsi="Times New Roman" w:cs="Times New Roman"/>
-          <w:sz w:val="22"/>
-          <w:szCs w:val="22"/>
-        </w:rPr>
-        <w:tab/>
-        <w:t xml:space="preserve">            </w:t>
-      </w:r>
-      <w:r>
-        <w:rPr>
-          <w:rFonts w:ascii="Times New Roman" w:hAnsi="Times New Roman" w:cs="Times New Roman"/>
-          <w:sz w:val="22"/>
-          <w:szCs w:val="22"/>
-        </w:rPr>
-        <w:t xml:space="preserve">   </w:t>
-      </w:r>
-      <w:proofErr w:type="spellStart"/>
-      <w:r>
-        <w:rPr>
-          <w:rFonts w:ascii="Times New Roman" w:hAnsi="Times New Roman" w:cs="Times New Roman"/>
-          <w:sz w:val="22"/>
-          <w:szCs w:val="22"/>
-        </w:rPr>
-        <w:t>Xiamen</w:t>
-      </w:r>
-      <w:proofErr w:type="spellEnd"/>
-      <w:r>
-        <w:rPr>
-          <w:rFonts w:ascii="Times New Roman" w:hAnsi="Times New Roman" w:cs="Times New Roman"/>
-          <w:sz w:val="22"/>
-          <w:szCs w:val="22"/>
-        </w:rPr>
-        <w:t>,</w:t>
-      </w:r>
-      <w:r>
-        <w:rPr>
-          <w:rFonts w:ascii="Times New Roman" w:hAnsi="Times New Roman" w:cs="Times New Roman" w:hint="eastAsia"/>
-          <w:sz w:val="22"/>
-          <w:szCs w:val="22"/>
-        </w:rPr>
-        <w:t xml:space="preserve"> </w:t>
-      </w:r>
-      <w:r>
-        <w:rPr>
-          <w:rFonts w:ascii="Times New Roman" w:hAnsi="Times New Roman" w:cs="Times New Roman"/>
-          <w:sz w:val="22"/>
-          <w:szCs w:val="22"/>
-        </w:rPr>
-        <w:t>China</w:t>
-      </w:r>
-    </w:p>
-    <w:p>
-      <w:pPr>
-        <w:jc w:val="distribute"/>
-        <w:rPr>
-          <w:rFonts w:ascii="Times New Roman" w:hAnsi="Times New Roman" w:cs="Times New Roman"/>
-          <w:sz w:val="22"/>
-          <w:szCs w:val="22"/>
-        </w:rPr>
-      </w:pPr>
-      <w:r>
-        <w:rPr>
-          <w:rFonts w:ascii="Times New Roman" w:hAnsi="Times New Roman" w:cs="Times New Roman"/>
-          <w:i/>
-          <w:iCs/>
-          <w:sz w:val="22"/>
-          <w:szCs w:val="22"/>
-        </w:rPr>
-        <w:t xml:space="preserve">Innovation Center Intern                       </w:t>
-      </w:r>
-      <w:r>
-        <w:rPr>
-          <w:rFonts w:ascii="Times New Roman" w:hAnsi="Times New Roman" w:cs="Times New Roman"/>
-          <w:i/>
-          <w:iCs/>
-          <w:sz w:val="22"/>
-          <w:szCs w:val="22"/>
-        </w:rPr>
-        <w:tab/>
-      </w:r>
-      <w:r>
-        <w:rPr>
-          <w:rFonts w:ascii="Times New Roman" w:hAnsi="Times New Roman" w:cs="Times New Roman"/>
-          <w:sz w:val="22"/>
-          <w:szCs w:val="22"/>
-        </w:rPr>
-        <w:tab/>
-      </w:r>
-      <w:r>
-        <w:rPr>
-          <w:rFonts w:ascii="Times New Roman" w:hAnsi="Times New Roman" w:cs="Times New Roman"/>
-          <w:sz w:val="22"/>
-          <w:szCs w:val="22"/>
-        </w:rPr>
-        <w:tab/>
-      </w:r>
-      <w:r>
-        <w:rPr>
-          <w:rFonts w:ascii="Times New Roman" w:hAnsi="Times New Roman" w:cs="Times New Roman"/>
-          <w:sz w:val="22"/>
-          <w:szCs w:val="22"/>
-        </w:rPr>
-        <w:tab/>
-      </w:r>
-      <w:r>
-        <w:rPr>
-          <w:rFonts w:ascii="Times New Roman" w:hAnsi="Times New Roman" w:cs="Times New Roman"/>
-          <w:sz w:val="22"/>
-          <w:szCs w:val="22"/>
-        </w:rPr>
-        <w:tab/>
-      </w:r>
-      <w:r>
-        <w:rPr>
-          <w:rFonts w:ascii="Times New Roman" w:hAnsi="Times New Roman" w:cs="Times New Roman"/>
-          <w:i/>
-          <w:iCs/>
-          <w:sz w:val="22"/>
-          <w:szCs w:val="22"/>
-        </w:rPr>
-        <w:t xml:space="preserve">    </w:t>
-      </w:r>
-      <w:r>
-        <w:rPr>
-          <w:rFonts w:ascii="Times New Roman" w:hAnsi="Times New Roman" w:cs="Times New Roman"/>
-          <w:i/>
-          <w:iCs/>
-          <w:sz w:val="22"/>
-          <w:szCs w:val="22"/>
-        </w:rPr>
-        <w:t xml:space="preserve">     </w:t>
-      </w:r>
-      <w:r>
-        <w:rPr>
-          <w:rFonts w:ascii="Times New Roman" w:hAnsi="Times New Roman" w:cs="Times New Roman"/>
-          <w:sz w:val="22"/>
-          <w:szCs w:val="22"/>
-        </w:rPr>
-        <w:t xml:space="preserve"> </w:t>
-      </w:r>
-      <w:r>
-        <w:rPr>
-          <w:rFonts w:ascii="Times New Roman" w:hAnsi="Times New Roman" w:cs="Times New Roman"/>
-          <w:sz w:val="22"/>
-          <w:szCs w:val="22"/>
-        </w:rPr>
-        <w:t xml:space="preserve"> </w:t>
-      </w:r>
-      <w:r>
-        <w:rPr>
-          <w:rFonts w:ascii="Times New Roman" w:hAnsi="Times New Roman" w:cs="Times New Roman"/>
-          <w:sz w:val="22"/>
-          <w:szCs w:val="22"/>
-        </w:rPr>
-        <w:t xml:space="preserve"> </w:t>
-      </w:r>
-      <w:r>
-        <w:rPr>
-          <w:rFonts w:ascii="Times New Roman" w:hAnsi="Times New Roman" w:cs="Times New Roman"/>
-          <w:sz w:val="22"/>
-          <w:szCs w:val="22"/>
-        </w:rPr>
-        <w:t>July</w:t>
-      </w:r>
-      <w:r>
-        <w:rPr>
-          <w:rFonts w:ascii="Times New Roman" w:hAnsi="Times New Roman" w:cs="Times New Roman"/>
-          <w:i/>
-          <w:iCs/>
-          <w:sz w:val="22"/>
-          <w:szCs w:val="22"/>
-        </w:rPr>
-        <w:t xml:space="preserve"> </w:t>
-      </w:r>
-      <w:r>
-        <w:rPr>
-          <w:rFonts w:ascii="Times New Roman" w:hAnsi="Times New Roman" w:cs="Times New Roman"/>
-          <w:sz w:val="22"/>
-          <w:szCs w:val="22"/>
-        </w:rPr>
-        <w:t>2022</w:t>
-      </w:r>
-      <w:r>
-        <w:rPr>
-          <w:rFonts w:ascii="Times New Roman" w:hAnsi="Times New Roman" w:cs="Times New Roman"/>
-          <w:sz w:val="22"/>
-          <w:szCs w:val="22"/>
-        </w:rPr>
-        <w:t xml:space="preserve"> </w:t>
-      </w:r>
-      <w:r>
-        <w:rPr>
-          <w:rFonts w:ascii="Times New Roman" w:hAnsi="Times New Roman" w:cs="Times New Roman"/>
-          <w:sz w:val="22"/>
-          <w:szCs w:val="22"/>
-        </w:rPr>
-        <w:t>-</w:t>
-      </w:r>
-      <w:r>
-        <w:rPr>
-          <w:rFonts w:ascii="Times New Roman" w:hAnsi="Times New Roman" w:cs="Times New Roman"/>
-          <w:sz w:val="22"/>
-          <w:szCs w:val="22"/>
-        </w:rPr>
-        <w:t xml:space="preserve"> </w:t>
-      </w:r>
-      <w:r>
-        <w:rPr>
-          <w:rFonts w:ascii="Times New Roman" w:hAnsi="Times New Roman" w:cs="Times New Roman"/>
-          <w:sz w:val="22"/>
-          <w:szCs w:val="22"/>
-        </w:rPr>
-        <w:t xml:space="preserve">October </w:t>
-      </w:r>
-      <w:r>
-        <w:rPr>
-          <w:rFonts w:ascii="Times New Roman" w:hAnsi="Times New Roman" w:cs="Times New Roman"/>
-          <w:sz w:val="22"/>
-          <w:szCs w:val="22"/>
-        </w:rPr>
-        <w:t xml:space="preserve">2022 </w:t>
+          <w:sz w:val="22"/>
+          <w:szCs w:val="22"/>
+        </w:rPr>
+        <w:t xml:space="preserve">Built </w:t>
+      </w:r>
+      <w:r>
+        <w:rPr>
+          <w:rFonts w:ascii="Times New Roman" w:hAnsi="Times New Roman" w:cs="Times New Roman" w:hint="eastAsia"/>
+          <w:sz w:val="22"/>
+          <w:szCs w:val="22"/>
+        </w:rPr>
+        <w:t xml:space="preserve">a dataset of industrial components with noisy backgrounds, enabling robust training pipelines. </w:t>
       </w:r>
     </w:p>
     <w:p>
@@ -1688,19 +1763,11 @@
       </w:pPr>
       <w:r>
         <w:rPr>
-          <w:rFonts w:ascii="Times New Roman" w:hAnsi="Times New Roman" w:cs="Times New Roman"/>
-          <w:sz w:val="22"/>
-          <w:szCs w:val="22"/>
-        </w:rPr>
-        <w:t xml:space="preserve">Built </w:t>
-      </w:r>
-      <w:r>
-        <w:rPr>
-          <w:rFonts w:ascii="Times New Roman" w:hAnsi="Times New Roman" w:cs="Times New Roman" w:hint="eastAsia"/>
-          <w:sz w:val="22"/>
-          <w:szCs w:val="22"/>
-        </w:rPr>
-        <w:t xml:space="preserve">a dataset of industrial components with noisy backgrounds, enabling robust training pipelines. </w:t>
+          <w:rFonts w:ascii="Times New Roman" w:hAnsi="Times New Roman" w:cs="Times New Roman" w:hint="eastAsia"/>
+          <w:sz w:val="22"/>
+          <w:szCs w:val="22"/>
+        </w:rPr>
+        <w:t>Developed a mutual information maximization based unsupervised image segmentation algorithm.</w:t>
       </w:r>
     </w:p>
     <w:p>
@@ -1724,30 +1791,6 @@
           <w:sz w:val="22"/>
           <w:szCs w:val="22"/>
         </w:rPr>
-        <w:t>Developed a mutual information maximization based unsupervised image segmentation algorithm.</w:t>
-      </w:r>
-    </w:p>
-    <w:p>
-      <w:pPr>
-        <w:pStyle w:val="ListParagraph"/>
-        <w:numPr>
-          <w:ilvl w:val="0"/>
-          <w:numId w:val="5"/>
-        </w:numPr>
-        <w:ind w:left="714" w:hanging="357"/>
-        <w:jc w:val="both"/>
-        <w:rPr>
-          <w:rFonts w:ascii="Times New Roman" w:hAnsi="Times New Roman" w:cs="Times New Roman"/>
-          <w:sz w:val="22"/>
-          <w:szCs w:val="22"/>
-        </w:rPr>
-      </w:pPr>
-      <w:r>
-        <w:rPr>
-          <w:rFonts w:ascii="Times New Roman" w:hAnsi="Times New Roman" w:cs="Times New Roman" w:hint="eastAsia"/>
-          <w:sz w:val="22"/>
-          <w:szCs w:val="22"/>
-        </w:rPr>
         <w:t xml:space="preserve">Achieved strong visualization performance on our dataset </w:t>
       </w:r>
     </w:p>
@@ -2430,6 +2473,7 @@
           <w:sz w:val="22"/>
           <w:szCs w:val="22"/>
         </w:rPr>
+        <w:lastRenderedPageBreak/>
         <w:t>Proposed 1) LLM-based prompt elaboration. 2) Few-shot learning for frame consistency.</w:t>
       </w:r>
     </w:p>
@@ -2483,7 +2527,6 @@
           <w:sz w:val="22"/>
           <w:szCs w:val="22"/>
         </w:rPr>
-        <w:lastRenderedPageBreak/>
         <w:t xml:space="preserve">Stage-Aware </w:t>
       </w:r>
       <w:r>

</xml_diff>

<commit_message>
Rename Projects to Academic Projects, update resume 1Bench bullets
Co-Authored-By: Claude Opus 4.6 <noreply@anthropic.com>
</commit_message>
<xml_diff>
--- a/assets/Chunjiang Liu Resume.docx
+++ b/assets/Chunjiang Liu Resume.docx
@@ -960,7 +960,7 @@
           <w:rFonts w:ascii="Times New Roman" w:hAnsi="Times New Roman"/>
           <w:sz w:val="22"/>
         </w:rPr>
-        <w:t>Designed and built interactive leaderboard UI with Next.js.</w:t>
+        <w:t>Built interactive leaderboard UI and benchmark dashboard with Next.js.</w:t>
       </w:r>
     </w:p>
     <w:p>
@@ -982,21 +982,19 @@
           <w:rFonts w:ascii="Times New Roman" w:hAnsi="Times New Roman" w:hint="eastAsia"/>
           <w:sz w:val="22"/>
         </w:rPr>
-        <w:t xml:space="preserve">Built the evaluation environment for the </w:t>
+        <w:t>Crafted expert-level applied mathematics problems and designed the evaluation pipeline.</w:t>
       </w:r>
       <w:r>
         <w:rPr>
           <w:rFonts w:ascii="Times New Roman" w:hAnsi="Times New Roman"/>
           <w:sz w:val="22"/>
         </w:rPr>
-        <w:t>benchmark</w:t>
       </w:r>
       <w:r>
         <w:rPr>
           <w:rFonts w:ascii="Times New Roman" w:hAnsi="Times New Roman" w:hint="eastAsia"/>
           <w:sz w:val="22"/>
         </w:rPr>
-        <w:t>.</w:t>
       </w:r>
     </w:p>
     <w:p>

</xml_diff>